<commit_message>
Fix metadata headers, update authentic SNAME diagram, sync exact pagination and fix bibliography hanging indents
</commit_message>
<xml_diff>
--- a/Thesis/docx_export/BAB_2_LANDASAN_TEORI.docx
+++ b/Thesis/docx_export/BAB_2_LANDASAN_TEORI.docx
@@ -16,131 +16,6 @@
         <w:t>BAB II</w:t>
         <w:br/>
         <w:t>TINJAUAN PUSTAKA</w:t>
-      </w:r>
-    </w:p>
-    <w:p>
-      <w:pPr>
-        <w:spacing w:after="80" w:line="276" w:lineRule="auto"/>
-        <w:ind w:firstLine="567"/>
-        <w:jc w:val="both"/>
-      </w:pPr>
-      <w:r>
-        <w:rPr>
-          <w:rFonts w:ascii="Arial" w:hAnsi="Arial"/>
-          <w:sz w:val="20"/>
-        </w:rPr>
-        <w:t xml:space="preserve">Judul Proposal Tugas Akhir: ANALISIS KINEMATIKA, DINAMIKA, DAN ESTIMASI KEADAAN OPTIMAL </w:t>
-      </w:r>
-      <w:r>
-        <w:rPr>
-          <w:rFonts w:ascii="Arial" w:hAnsi="Arial"/>
-          <w:i/>
-          <w:sz w:val="20"/>
-        </w:rPr>
-        <w:t>KALMAN FILTER</w:t>
-      </w:r>
-      <w:r>
-        <w:rPr>
-          <w:rFonts w:ascii="Arial" w:hAnsi="Arial"/>
-          <w:sz w:val="20"/>
-        </w:rPr>
-        <w:t xml:space="preserve"> UNTUK </w:t>
-      </w:r>
-      <w:r>
-        <w:rPr>
-          <w:rFonts w:ascii="Arial" w:hAnsi="Arial"/>
-          <w:i/>
-          <w:sz w:val="20"/>
-        </w:rPr>
-        <w:t>VISION-BASED TRACKING</w:t>
-      </w:r>
-      <w:r>
-        <w:rPr>
-          <w:rFonts w:ascii="Arial" w:hAnsi="Arial"/>
-          <w:sz w:val="20"/>
-        </w:rPr>
-        <w:t xml:space="preserve"> PADA </w:t>
-      </w:r>
-      <w:r>
-        <w:rPr>
-          <w:rFonts w:ascii="Arial" w:hAnsi="Arial"/>
-          <w:i/>
-          <w:sz w:val="20"/>
-        </w:rPr>
-        <w:t>OVER-ACTUATED 8-THRUSTER 6-DOF VECTORED AUV</w:t>
-      </w:r>
-    </w:p>
-    <w:p>
-      <w:pPr>
-        <w:spacing w:after="80" w:line="276" w:lineRule="auto"/>
-        <w:ind w:firstLine="567"/>
-        <w:jc w:val="both"/>
-      </w:pPr>
-      <w:r>
-        <w:rPr>
-          <w:rFonts w:ascii="Arial" w:hAnsi="Arial"/>
-          <w:sz w:val="20"/>
-        </w:rPr>
-        <w:t xml:space="preserve">Analisis Kinematika, Dinamika, dan Estimasi Keadaan Optimal </w:t>
-      </w:r>
-      <w:r>
-        <w:rPr>
-          <w:rFonts w:ascii="Arial" w:hAnsi="Arial"/>
-          <w:i/>
-          <w:sz w:val="20"/>
-        </w:rPr>
-        <w:t>Kalman Filter</w:t>
-      </w:r>
-      <w:r>
-        <w:rPr>
-          <w:rFonts w:ascii="Arial" w:hAnsi="Arial"/>
-          <w:sz w:val="20"/>
-        </w:rPr>
-        <w:t xml:space="preserve"> untuk </w:t>
-      </w:r>
-      <w:r>
-        <w:rPr>
-          <w:rFonts w:ascii="Arial" w:hAnsi="Arial"/>
-          <w:i/>
-          <w:sz w:val="20"/>
-        </w:rPr>
-        <w:t>Vision-Based Tracking</w:t>
-      </w:r>
-      <w:r>
-        <w:rPr>
-          <w:rFonts w:ascii="Arial" w:hAnsi="Arial"/>
-          <w:sz w:val="20"/>
-        </w:rPr>
-        <w:t xml:space="preserve"> pada Over-Actuated 8-Thruster 6-DOF Vectored AUV</w:t>
-      </w:r>
-    </w:p>
-    <w:p>
-      <w:pPr>
-        <w:spacing w:after="80" w:line="276" w:lineRule="auto"/>
-        <w:ind w:firstLine="567"/>
-        <w:jc w:val="both"/>
-      </w:pPr>
-      <w:r>
-        <w:rPr>
-          <w:rFonts w:ascii="Arial" w:hAnsi="Arial"/>
-          <w:sz w:val="20"/>
-        </w:rPr>
-        <w:t>(</w:t>
-      </w:r>
-      <w:r>
-        <w:rPr>
-          <w:rFonts w:ascii="Arial" w:hAnsi="Arial"/>
-          <w:i/>
-          <w:sz w:val="20"/>
-        </w:rPr>
-        <w:t>Title</w:t>
-      </w:r>
-      <w:r>
-        <w:rPr>
-          <w:rFonts w:ascii="Arial" w:hAnsi="Arial"/>
-          <w:sz w:val="20"/>
-        </w:rPr>
-        <w:t>: Analysis of Kinematics, Dynamics, and Optimal Kalman Filter State Estimation for Vision-Based Tracking in an Over-Actuated 8-Thruster 6-DOF Vectored AUV)</w:t>
       </w:r>
     </w:p>
     <w:p>
@@ -3684,7 +3559,7 @@
       <w:r>
         <w:drawing>
           <wp:inline xmlns:a="http://schemas.openxmlformats.org/drawingml/2006/main" xmlns:pic="http://schemas.openxmlformats.org/drawingml/2006/picture">
-            <wp:extent cx="4608000" cy="2453180"/>
+            <wp:extent cx="3780000" cy="3895420"/>
             <wp:docPr id="1" name="Picture 1"/>
             <wp:cNvGraphicFramePr>
               <a:graphicFrameLocks noChangeAspect="1"/>
@@ -3705,7 +3580,7 @@
                   <pic:spPr>
                     <a:xfrm>
                       <a:off x="0" y="0"/>
-                      <a:ext cx="4608000" cy="2453180"/>
+                      <a:ext cx="3780000" cy="3895420"/>
                     </a:xfrm>
                     <a:prstGeom prst="rect"/>
                   </pic:spPr>
@@ -22705,7 +22580,7 @@
       <w:pgMar w:top="1276" w:right="1276" w:bottom="1276" w:left="1276" w:header="720" w:footer="720" w:gutter="0"/>
       <w:cols w:space="720"/>
       <w:docGrid w:linePitch="360"/>
-      <w:pgNumType w:fmt="decimal" w:start="9"/>
+      <w:pgNumType w:fmt="decimal" w:start="10"/>
     </w:sectPr>
   </w:body>
 </w:document>

</xml_diff>

<commit_message>
fix(thesis): flatten multiline equations and normalize matrix line breaks for Google Docs Auto-LaTeX compatibility
</commit_message>
<xml_diff>
--- a/Thesis/docx_export/BAB_2_LANDASAN_TEORI.docx
+++ b/Thesis/docx_export/BAB_2_LANDASAN_TEORI.docx
@@ -6423,7 +6423,7 @@
           <w:rFonts w:ascii="Arial" w:hAnsi="Arial"/>
           <w:sz w:val="20"/>
         </w:rPr>
-        <w:t>$$\boldsymbol{\eta} = \begin{bmatrix} \boldsymbol{\eta}_1 \\ \boldsymbol{\eta}_2 \end{bmatrix} = \begin{bmatrix} x \\ y \\ z \\ \phi \\ \theta \\ \psi \end{bmatrix} \in \mathbb{R}^6$$</w:t>
+        <w:t>$$\boldsymbol{\eta} = \begin{bmatrix} \boldsymbol{\eta}_1 \\ \boldsymbol{\eta}_2 \end{bmatrix} = \begin{bmatrix} x \\\\ y \\\\ z \\ \phi \\ \theta \\ \psi \end{bmatrix} \in \mathbb{R}^6$$</w:t>
       </w:r>
     </w:p>
     <w:p>
@@ -6554,7 +6554,7 @@
           <w:rFonts w:ascii="Arial" w:hAnsi="Arial"/>
           <w:sz w:val="20"/>
         </w:rPr>
-        <w:t>$$\boldsymbol{\nu} = \begin{bmatrix} \boldsymbol{\nu}_1 \\ \boldsymbol{\nu}_2 \end{bmatrix} = \begin{bmatrix} u \\ v \\ w \\ p \\ q \\ r \end{bmatrix} \in \mathbb{R}^6$$</w:t>
+        <w:t>$$\boldsymbol{\nu} = \begin{bmatrix} \boldsymbol{\nu}_1 \\ \boldsymbol{\nu}_2 \end{bmatrix} = \begin{bmatrix} u \\\\ v \\\\ w \\\\ p \\\\ q \\\\ r \end{bmatrix} \in \mathbb{R}^6$$</w:t>
       </w:r>
     </w:p>
     <w:p>
@@ -6731,7 +6731,7 @@
           <w:rFonts w:ascii="Arial" w:hAnsi="Arial"/>
           <w:sz w:val="20"/>
         </w:rPr>
-        <w:t>$$\boldsymbol{\tau} = \begin{bmatrix} \boldsymbol{\tau}_1 \\ \boldsymbol{\tau}_2 \end{bmatrix} = \begin{bmatrix} X \\ Y \\ Z \\ K \\ M \\ N \end{bmatrix} \in \mathbb{R}^6$$</w:t>
+        <w:t>$$\boldsymbol{\tau} = \begin{bmatrix} \boldsymbol{\tau}_1 \\ \boldsymbol{\tau}_2 \end{bmatrix} = \begin{bmatrix} X \\\\ Y \\\\ Z \\\\ K \\\\ M \\\\ N \end{bmatrix} \in \mathbb{R}^6$$</w:t>
       </w:r>
     </w:p>
     <w:p>
@@ -6897,7 +6897,7 @@
           <w:rFonts w:ascii="Arial" w:hAnsi="Arial"/>
           <w:sz w:val="20"/>
         </w:rPr>
-        <w:t>$$\mathbf{V}_c^n = \begin{bmatrix} u_c^n \\ v_c^n \\ w_c^n \\ 0 \\ 0 \\ 0 \end{bmatrix} \in \mathbb{R}^6, \qquad \dot{\mathbf{V}}_c^n \approx \mathbf{0}$$</w:t>
+        <w:t>$$\mathbf{V}_c^n = \begin{bmatrix} u_c^n \\\\ v_c^n \\\\ w_c^n \\\\ 0 \\\\ 0 \\\\ 0 \end{bmatrix} \in \mathbb{R}^6, \qquad \dot{\mathbf{V}}_c^n \approx \mathbf{0}$$</w:t>
       </w:r>
     </w:p>
     <w:p>
@@ -6967,7 +6967,7 @@
           <w:rFonts w:ascii="Arial" w:hAnsi="Arial"/>
           <w:sz w:val="20"/>
         </w:rPr>
-        <w:t>$$\boldsymbol{\nu}_c = \begin{bmatrix} \boldsymbol{\nu}_{c,1} \\ \boldsymbol{\nu}_{c,2} \end{bmatrix} = \begin{bmatrix} \mathbf{R}_n^b(\boldsymbol{\eta}_2) \mathbf{V}_{c,1}^n \\ \mathbf{0}_{3 \times 1} \end{bmatrix} = \begin{bmatrix} u_c \\ v_c \\ w_c \\ 0 \\ 0 \\ 0 \end{bmatrix}$$</w:t>
+        <w:t>$$\boldsymbol{\nu}_c = \begin{bmatrix} \boldsymbol{\nu}_{c,1} \\ \boldsymbol{\nu}_{c,2} \end{bmatrix} = \begin{bmatrix} \mathbf{R}_n^b(\boldsymbol{\eta}_2) \mathbf{V}_{c,1}^n \\ \mathbf{0}_{3 \times 1} \end{bmatrix} = \begin{bmatrix} u_c \\\\ v_c \\\\ w_c \\\\ 0 \\\\ 0 \\\\ 0 \end{bmatrix}$$</w:t>
       </w:r>
     </w:p>
     <w:p>
@@ -7024,7 +7024,7 @@
           <w:rFonts w:ascii="Arial" w:hAnsi="Arial"/>
           <w:sz w:val="20"/>
         </w:rPr>
-        <w:t>$$\boldsymbol{\nu}_r = \boldsymbol{\nu} - \boldsymbol{\nu}_c = \begin{bmatrix} u - u_c \\ v - v_c \\ w - w_c \\ p \\ q \\ r \end{bmatrix} = \begin{bmatrix} u_r \\ v_r \\ w_r \\ p \\ q \\ r \end{bmatrix}$$</w:t>
+        <w:t>$$\boldsymbol{\nu}_r = \boldsymbol{\nu} - \boldsymbol{\nu}_c = \begin{bmatrix} u - u_c \\\\ v - v_c \\\\ w - w_c \\\\ p \\\\ q \\\\ r \end{bmatrix} = \begin{bmatrix} u_r \\\\ v_r \\\\ w_r \\\\ p \\\\ q \\\\ r \end{bmatrix}$$</w:t>
       </w:r>
     </w:p>
     <w:p>
@@ -7983,7 +7983,7 @@
           <w:rFonts w:ascii="Arial" w:hAnsi="Arial"/>
           <w:sz w:val="20"/>
         </w:rPr>
-        <w:t>$$\mathbf{R}_{z,\psi} = \begin{bmatrix} \cos\psi &amp; -\sin\psi &amp; 0 \\ \sin\psi &amp; \cos\psi &amp; 0 \\ 0 &amp; 0 &amp; 1 \end{bmatrix}$$</w:t>
+        <w:t>$$\mathbf{R}_{z,\psi} = \begin{bmatrix} \cos\psi &amp; -\sin\psi &amp; 0 \\ \sin\psi &amp; \cos\psi &amp; 0 \\\\ 0 &amp; 0 &amp; 1 \end{bmatrix}$$</w:t>
       </w:r>
     </w:p>
     <w:p>
@@ -8056,7 +8056,7 @@
           <w:rFonts w:ascii="Arial" w:hAnsi="Arial"/>
           <w:sz w:val="20"/>
         </w:rPr>
-        <w:t>$$\mathbf{R}_{y,\theta} = \begin{bmatrix} \cos\theta &amp; 0 &amp; \sin\theta \\ 0 &amp; 1 &amp; 0 \\ -\sin\theta &amp; 0 &amp; \cos\theta \end{bmatrix}$$</w:t>
+        <w:t>$$\mathbf{R}_{y,\theta} = \begin{bmatrix} \cos\theta &amp; 0 &amp; \sin\theta \\\\ 0 &amp; 1 &amp; 0 \\\\ -\sin\theta &amp; 0 &amp; \cos\theta \end{bmatrix}$$</w:t>
       </w:r>
     </w:p>
     <w:p>
@@ -8129,7 +8129,7 @@
           <w:rFonts w:ascii="Arial" w:hAnsi="Arial"/>
           <w:sz w:val="20"/>
         </w:rPr>
-        <w:t>$$\mathbf{R}_{x,\phi} = \begin{bmatrix} 1 &amp; 0 &amp; 0 \\ 0 &amp; \cos\phi &amp; -\sin\phi \\ 0 &amp; \sin\phi &amp; \cos\phi \end{bmatrix}$$</w:t>
+        <w:t>$$\mathbf{R}_{x,\phi} = \begin{bmatrix} 1 &amp; 0 &amp; 0 \\\\ 0 &amp; \cos\phi &amp; -\sin\phi \\\\ 0 &amp; \sin\phi &amp; \cos\phi \end{bmatrix}$$</w:t>
       </w:r>
     </w:p>
     <w:p>
@@ -8185,7 +8185,7 @@
           <w:rFonts w:ascii="Arial" w:hAnsi="Arial"/>
           <w:sz w:val="20"/>
         </w:rPr>
-        <w:t>$$\mathbf{A} = \mathbf{R}_{y,\theta} \mathbf{R}_{x,\phi} = \begin{bmatrix} \cos\theta &amp; 0 &amp; \sin\theta \\ 0 &amp; 1 &amp; 0 \\ -\sin\theta &amp; 0 &amp; \cos\theta \end{bmatrix} \begin{bmatrix} 1 &amp; 0 &amp; 0 \\ 0 &amp; \cos\phi &amp; -\sin\phi \\ 0 &amp; \sin\phi &amp; \cos\phi \end{bmatrix} = \begin{bmatrix} \cos\theta &amp; \sin\theta\sin\phi &amp; \sin\theta\cos\phi \\ 0 &amp; \cos\phi &amp; -\sin\phi \\ -\sin\theta &amp; \cos\theta\sin\phi &amp; \cos\theta\cos\phi \end{bmatrix}$$</w:t>
+        <w:t>$$\mathbf{A} = \mathbf{R}_{y,\theta} \mathbf{R}_{x,\phi} = \begin{bmatrix} \cos\theta &amp; 0 &amp; \sin\theta \\\\ 0 &amp; 1 &amp; 0 \\\\ -\sin\theta &amp; 0 &amp; \cos\theta \end{bmatrix} \begin{bmatrix} 1 &amp; 0 &amp; 0 \\\\ 0 &amp; \cos\phi &amp; -\sin\phi \\\\ 0 &amp; \sin\phi &amp; \cos\phi \end{bmatrix} = \begin{bmatrix} \cos\theta &amp; \sin\theta\sin\phi &amp; \sin\theta\cos\phi \\\\ 0 &amp; \cos\phi &amp; -\sin\phi \\\\ -\sin\theta &amp; \cos\theta\sin\phi &amp; \cos\theta\cos\phi \end{bmatrix}$$</w:t>
       </w:r>
     </w:p>
     <w:p>
@@ -8241,7 +8241,7 @@
           <w:rFonts w:ascii="Arial" w:hAnsi="Arial"/>
           <w:sz w:val="20"/>
         </w:rPr>
-        <w:t>$$\mathbf{R}_b^n(\boldsymbol{\eta}_2) = \begin{bmatrix} \cos\psi &amp; -\sin\psi &amp; 0 \\ \sin\psi &amp; \cos\psi &amp; 0 \\ 0 &amp; 0 &amp; 1 \end{bmatrix} \begin{bmatrix} \cos\theta &amp; \sin\theta\sin\phi &amp; \sin\theta\cos\phi \\ 0 &amp; \cos\phi &amp; -\sin\phi \\ -\sin\theta &amp; \cos\theta\sin\phi &amp; \cos\theta\cos\phi \end{bmatrix}$$</w:t>
+        <w:t>$$\mathbf{R}_b^n(\boldsymbol{\eta}_2) = \begin{bmatrix} \cos\psi &amp; -\sin\psi &amp; 0 \\ \sin\psi &amp; \cos\psi &amp; 0 \\\\ 0 &amp; 0 &amp; 1 \end{bmatrix} \begin{bmatrix} \cos\theta &amp; \sin\theta\sin\phi &amp; \sin\theta\cos\phi \\\\ 0 &amp; \cos\phi &amp; -\sin\phi \\\\ -\sin\theta &amp; \cos\theta\sin\phi &amp; \cos\theta\cos\phi \end{bmatrix}$$</w:t>
       </w:r>
     </w:p>
     <w:p>
@@ -8260,6 +8260,20 @@
     </w:p>
     <w:p>
       <w:pPr>
+        <w:spacing w:before="120" w:after="120"/>
+        <w:ind w:firstLine="0"/>
+        <w:jc w:val="center"/>
+      </w:pPr>
+      <w:r>
+        <w:rPr>
+          <w:rFonts w:ascii="Arial" w:hAnsi="Arial"/>
+          <w:sz w:val="20"/>
+        </w:rPr>
+        <w:t>$$\mathbf{R}_b^n(\boldsymbol{\eta}_2) = \begin{bmatrix} \cos\psi\cos\theta &amp; -\sin\psi\cos\phi + \cos\psi\sin\theta\sin\phi &amp; \sin\psi\sin\phi + \cos\psi\sin\theta\cos\phi \\\ \sin\psi\cos\theta &amp; \cos\psi\cos\phi + \sin\psi\sin\theta\sin\phi &amp; -\cos\psi\sin\phi + \sin\psi\sin\theta\cos\phi \\\\ -\sin\theta &amp; \cos\theta\sin\phi &amp; \cos\theta\cos\phi \end{bmatrix}$$</w:t>
+      </w:r>
+    </w:p>
+    <w:p>
+      <w:pPr>
         <w:spacing w:after="80" w:line="276" w:lineRule="auto"/>
         <w:ind w:firstLine="567"/>
         <w:jc w:val="both"/>
@@ -8269,76 +8283,6 @@
           <w:rFonts w:ascii="Arial" w:hAnsi="Arial"/>
           <w:sz w:val="20"/>
         </w:rPr>
-        <w:t>$$\mathbf{R}_b^n(\boldsymbol{\eta}_2) = \begin{bmatrix}</w:t>
-      </w:r>
-    </w:p>
-    <w:p>
-      <w:pPr>
-        <w:spacing w:after="80" w:line="276" w:lineRule="auto"/>
-        <w:ind w:firstLine="567"/>
-        <w:jc w:val="both"/>
-      </w:pPr>
-      <w:r>
-        <w:rPr>
-          <w:rFonts w:ascii="Arial" w:hAnsi="Arial"/>
-          <w:sz w:val="20"/>
-        </w:rPr>
-        <w:t>\cos\psi\cos\theta &amp; -\sin\psi\cos\phi + \cos\psi\sin\theta\sin\phi &amp; \sin\psi\sin\phi + \cos\psi\sin\theta\cos\phi \\</w:t>
-      </w:r>
-    </w:p>
-    <w:p>
-      <w:pPr>
-        <w:spacing w:after="80" w:line="276" w:lineRule="auto"/>
-        <w:ind w:firstLine="567"/>
-        <w:jc w:val="both"/>
-      </w:pPr>
-      <w:r>
-        <w:rPr>
-          <w:rFonts w:ascii="Arial" w:hAnsi="Arial"/>
-          <w:sz w:val="20"/>
-        </w:rPr>
-        <w:t>\sin\psi\cos\theta &amp; \cos\psi\cos\phi + \sin\psi\sin\theta\sin\phi &amp; -\cos\psi\sin\phi + \sin\psi\sin\theta\cos\phi \\</w:t>
-      </w:r>
-    </w:p>
-    <w:p>
-      <w:pPr>
-        <w:spacing w:after="80" w:line="276" w:lineRule="auto"/>
-        <w:ind w:firstLine="567"/>
-        <w:jc w:val="both"/>
-      </w:pPr>
-      <w:r>
-        <w:rPr>
-          <w:rFonts w:ascii="Arial" w:hAnsi="Arial"/>
-          <w:sz w:val="20"/>
-        </w:rPr>
-        <w:t>-\sin\theta &amp; \cos\theta\sin\phi &amp; \cos\theta\cos\phi</w:t>
-      </w:r>
-    </w:p>
-    <w:p>
-      <w:pPr>
-        <w:spacing w:after="80" w:line="276" w:lineRule="auto"/>
-        <w:ind w:firstLine="567"/>
-        <w:jc w:val="both"/>
-      </w:pPr>
-      <w:r>
-        <w:rPr>
-          <w:rFonts w:ascii="Arial" w:hAnsi="Arial"/>
-          <w:sz w:val="20"/>
-        </w:rPr>
-        <w:t>\end{bmatrix}$$</w:t>
-      </w:r>
-    </w:p>
-    <w:p>
-      <w:pPr>
-        <w:spacing w:after="80" w:line="276" w:lineRule="auto"/>
-        <w:ind w:firstLine="567"/>
-        <w:jc w:val="both"/>
-      </w:pPr>
-      <w:r>
-        <w:rPr>
-          <w:rFonts w:ascii="Arial" w:hAnsi="Arial"/>
-          <w:sz w:val="20"/>
-        </w:rPr>
         <w:t xml:space="preserve">Karena sifat ortogonalitas </w:t>
       </w:r>
       <w:r>
@@ -8358,72 +8302,16 @@
     </w:p>
     <w:p>
       <w:pPr>
-        <w:spacing w:after="80" w:line="276" w:lineRule="auto"/>
-        <w:ind w:firstLine="567"/>
-        <w:jc w:val="both"/>
-      </w:pPr>
-      <w:r>
-        <w:rPr>
-          <w:rFonts w:ascii="Arial" w:hAnsi="Arial"/>
-          <w:sz w:val="20"/>
-        </w:rPr>
-        <w:t>$$\mathbf{R}_n^b(\boldsymbol{\eta}_2) = (\mathbf{R}_b^n(\boldsymbol{\eta}_2))^T = \begin{bmatrix}</w:t>
-      </w:r>
-    </w:p>
-    <w:p>
-      <w:pPr>
-        <w:spacing w:after="80" w:line="276" w:lineRule="auto"/>
-        <w:ind w:firstLine="567"/>
-        <w:jc w:val="both"/>
-      </w:pPr>
-      <w:r>
-        <w:rPr>
-          <w:rFonts w:ascii="Arial" w:hAnsi="Arial"/>
-          <w:sz w:val="20"/>
-        </w:rPr>
-        <w:t>\cos\psi\cos\theta &amp; \sin\psi\cos\theta &amp; -\sin\theta \\</w:t>
-      </w:r>
-    </w:p>
-    <w:p>
-      <w:pPr>
-        <w:spacing w:after="80" w:line="276" w:lineRule="auto"/>
-        <w:ind w:firstLine="567"/>
-        <w:jc w:val="both"/>
-      </w:pPr>
-      <w:r>
-        <w:rPr>
-          <w:rFonts w:ascii="Arial" w:hAnsi="Arial"/>
-          <w:sz w:val="20"/>
-        </w:rPr>
-        <w:t>-\sin\psi\cos\phi + \cos\psi\sin\theta\sin\phi &amp; \cos\psi\cos\phi + \sin\psi\sin\theta\sin\phi &amp; \cos\theta\sin\phi \\</w:t>
-      </w:r>
-    </w:p>
-    <w:p>
-      <w:pPr>
-        <w:spacing w:after="80" w:line="276" w:lineRule="auto"/>
-        <w:ind w:firstLine="567"/>
-        <w:jc w:val="both"/>
-      </w:pPr>
-      <w:r>
-        <w:rPr>
-          <w:rFonts w:ascii="Arial" w:hAnsi="Arial"/>
-          <w:sz w:val="20"/>
-        </w:rPr>
-        <w:t>\sin\psi\sin\phi + \cos\psi\sin\theta\cos\phi &amp; -\cos\psi\sin\phi + \sin\psi\sin\theta\cos\phi &amp; \cos\theta\cos\phi</w:t>
-      </w:r>
-    </w:p>
-    <w:p>
-      <w:pPr>
-        <w:spacing w:after="80" w:line="276" w:lineRule="auto"/>
-        <w:ind w:firstLine="567"/>
-        <w:jc w:val="both"/>
-      </w:pPr>
-      <w:r>
-        <w:rPr>
-          <w:rFonts w:ascii="Arial" w:hAnsi="Arial"/>
-          <w:sz w:val="20"/>
-        </w:rPr>
-        <w:t>\end{bmatrix}$$</w:t>
+        <w:spacing w:before="120" w:after="120"/>
+        <w:ind w:firstLine="0"/>
+        <w:jc w:val="center"/>
+      </w:pPr>
+      <w:r>
+        <w:rPr>
+          <w:rFonts w:ascii="Arial" w:hAnsi="Arial"/>
+          <w:sz w:val="20"/>
+        </w:rPr>
+        <w:t>$$\mathbf{R}_n^b(\boldsymbol{\eta}_2) = (\mathbf{R}_b^n(\boldsymbol{\eta}_2))^T = \begin{bmatrix} \cos\psi\cos\theta &amp; \sin\psi\cos\theta &amp; -\sin\theta \\\\ -\sin\psi\cos\phi + \cos\psi\sin\theta\sin\phi &amp; \cos\psi\cos\phi + \sin\psi\sin\theta\sin\phi &amp; \cos\theta\sin\phi \\\ \sin\psi\sin\phi + \cos\psi\sin\theta\cos\phi &amp; -\cos\psi\sin\phi + \sin\psi\sin\theta\cos\phi &amp; \cos\theta\cos\phi \end{bmatrix}$$</w:t>
       </w:r>
     </w:p>
     <w:p>
@@ -8582,7 +8470,7 @@
           <w:rFonts w:ascii="Arial" w:hAnsi="Arial"/>
           <w:sz w:val="20"/>
         </w:rPr>
-        <w:t>$$\boldsymbol{\nu}_2 = \begin{bmatrix} p \\ q \\ r \end{bmatrix} = \begin{bmatrix} \dot{\phi} \\ 0 \\ 0 \end{bmatrix} + \mathbf{R}_{x,\phi}^T \begin{bmatrix} 0 \\ \dot{\theta} \\ 0 \end{bmatrix} + \mathbf{R}_{x,\phi}^T \mathbf{R}_{y,\theta}^T \begin{bmatrix} 0 \\ 0 \\ \dot{\psi} \end{bmatrix}$$</w:t>
+        <w:t>$$\boldsymbol{\nu}_2 = \begin{bmatrix} p \\\\ q \\\\ r \end{bmatrix} = \begin{bmatrix} \dot{\phi} \\\\ 0 \\\\ 0 \end{bmatrix} + \mathbf{R}_{x,\phi}^T \begin{bmatrix} 0 \\ \dot{\theta} \\\\ 0 \end{bmatrix} + \mathbf{R}_{x,\phi}^T \mathbf{R}_{y,\theta}^T \begin{bmatrix} 0 \\\\ 0 \\ \dot{\psi} \end{bmatrix}$$</w:t>
       </w:r>
     </w:p>
     <w:p>
@@ -8610,7 +8498,7 @@
           <w:rFonts w:ascii="Arial" w:hAnsi="Arial"/>
           <w:sz w:val="20"/>
         </w:rPr>
-        <w:t>$$\mathbf{R}_{x,\phi}^T \begin{bmatrix} 0 \\ \dot{\theta} \\ 0 \end{bmatrix} = \begin{bmatrix} 1 &amp; 0 &amp; 0 \\ 0 &amp; \cos\phi &amp; \sin\phi \\ 0 &amp; -\sin\phi &amp; \cos\phi \end{bmatrix} \begin{bmatrix} 0 \\ \dot{\theta} \\ 0 \end{bmatrix} = \begin{bmatrix} 0 \\ \dot{\theta}\cos\phi \\ -\dot{\theta}\sin\phi \end{bmatrix}$$</w:t>
+        <w:t>$$\mathbf{R}_{x,\phi}^T \begin{bmatrix} 0 \\ \dot{\theta} \\\\ 0 \end{bmatrix} = \begin{bmatrix} 1 &amp; 0 &amp; 0 \\\\ 0 &amp; \cos\phi &amp; \sin\phi \\\\ 0 &amp; -\sin\phi &amp; \cos\phi \end{bmatrix} \begin{bmatrix} 0 \\ \dot{\theta} \\\\ 0 \end{bmatrix} = \begin{bmatrix} 0 \\ \dot{\theta}\cos\phi \\\\ -\dot{\theta}\sin\phi \end{bmatrix}$$</w:t>
       </w:r>
     </w:p>
     <w:p>
@@ -8624,7 +8512,7 @@
           <w:rFonts w:ascii="Arial" w:hAnsi="Arial"/>
           <w:sz w:val="20"/>
         </w:rPr>
-        <w:t>$$\mathbf{R}_{x,\phi}^T \mathbf{R}_{y,\theta}^T \begin{bmatrix} 0 \\ 0 \\ \dot{\psi} \end{bmatrix} = \begin{bmatrix} \cos\theta &amp; 0 &amp; -\sin\theta \\ \sin\theta\sin\phi &amp; \cos\phi &amp; \cos\theta\sin\phi \\ \sin\theta\cos\phi &amp; -\sin\phi &amp; \cos\theta\cos\phi \end{bmatrix} \begin{bmatrix} 0 \\ 0 \\ \dot{\psi} \end{bmatrix} = \begin{bmatrix} -\dot{\psi}\sin\theta \\ \dot{\psi}\sin\phi\cos\theta \\ \dot{\psi}\cos\phi\cos\theta \end{bmatrix}$$</w:t>
+        <w:t>$$\mathbf{R}_{x,\phi}^T \mathbf{R}_{y,\theta}^T \begin{bmatrix} 0 \\\\ 0 \\ \dot{\psi} \end{bmatrix} = \begin{bmatrix} \cos\theta &amp; 0 &amp; -\sin\theta \\ \sin\theta\sin\phi &amp; \cos\phi &amp; \cos\theta\sin\phi \\ \sin\theta\cos\phi &amp; -\sin\phi &amp; \cos\theta\cos\phi \end{bmatrix} \begin{bmatrix} 0 \\\\ 0 \\ \dot{\psi} \end{bmatrix} = \begin{bmatrix} -\dot{\psi}\sin\theta \\ \dot{\psi}\sin\phi\cos\theta \\ \dot{\psi}\cos\phi\cos\theta \end{bmatrix}$$</w:t>
       </w:r>
     </w:p>
     <w:p>
@@ -8652,7 +8540,7 @@
           <w:rFonts w:ascii="Arial" w:hAnsi="Arial"/>
           <w:sz w:val="20"/>
         </w:rPr>
-        <w:t>$$\begin{bmatrix} p \\ q \\ r \end{bmatrix} = \begin{bmatrix} 1 &amp; 0 &amp; -\sin\theta \\ 0 &amp; \cos\phi &amp; \sin\phi\cos\theta \\ 0 &amp; -\sin\phi &amp; \cos\phi\cos\theta \end{bmatrix} \begin{bmatrix} \dot{\phi} \\ \dot{\theta} \\ \dot{\psi} \end{bmatrix} \iff \boldsymbol{\nu}_2 = \mathbf{T}_\Theta^{-1}(\boldsymbol{\eta}_2)\dot{\boldsymbol{\eta}}_2$$</w:t>
+        <w:t>$$\begin{bmatrix} p \\\\ q \\\\ r \end{bmatrix} = \begin{bmatrix} 1 &amp; 0 &amp; -\sin\theta \\\\ 0 &amp; \cos\phi &amp; \sin\phi\cos\theta \\\\ 0 &amp; -\sin\phi &amp; \cos\phi\cos\theta \end{bmatrix} \begin{bmatrix} \dot{\phi} \\ \dot{\theta} \\ \dot{\psi} \end{bmatrix} \iff \boldsymbol{\nu}_2 = \mathbf{T}_\Theta^{-1}(\boldsymbol{\eta}_2)\dot{\boldsymbol{\eta}}_2$$</w:t>
       </w:r>
     </w:p>
     <w:p>
@@ -9111,7 +8999,7 @@
           <w:rFonts w:ascii="Arial" w:hAnsi="Arial"/>
           <w:sz w:val="20"/>
         </w:rPr>
-        <w:t>$$\text{adj}(\mathbf{B}) = \begin{bmatrix} \cos\theta &amp; \sin\phi\sin\theta &amp; \cos\phi\sin\theta \\ 0 &amp; \cos\phi\cos\theta &amp; -\sin\phi\cos\theta \\ 0 &amp; \sin\phi &amp; \cos\phi \end{bmatrix}$$</w:t>
+        <w:t>$$\text{adj}(\mathbf{B}) = \begin{bmatrix} \cos\theta &amp; \sin\phi\sin\theta &amp; \cos\phi\sin\theta \\\\ 0 &amp; \cos\phi\cos\theta &amp; -\sin\phi\cos\theta \\\\ 0 &amp; \sin\phi &amp; \cos\phi \end{bmatrix}$$</w:t>
       </w:r>
     </w:p>
     <w:p>
@@ -9156,7 +9044,7 @@
           <w:rFonts w:ascii="Arial" w:hAnsi="Arial"/>
           <w:sz w:val="20"/>
         </w:rPr>
-        <w:t>$$\mathbf{T}_\Theta(\boldsymbol{\eta}_2) = \frac{1}{\det(\mathbf{B})} \text{adj}(\mathbf{B}) = \frac{1}{\cos\theta} \begin{bmatrix} \cos\theta &amp; \sin\phi\sin\theta &amp; \cos\phi\sin\theta \\ 0 &amp; \cos\phi\cos\theta &amp; -\sin\phi\cos\theta \\ 0 &amp; \sin\phi &amp; \cos\phi \end{bmatrix}$$</w:t>
+        <w:t>$$\mathbf{T}_\Theta(\boldsymbol{\eta}_2) = \frac{1}{\det(\mathbf{B})} \text{adj}(\mathbf{B}) = \frac{1}{\cos\theta} \begin{bmatrix} \cos\theta &amp; \sin\phi\sin\theta &amp; \cos\phi\sin\theta \\\\ 0 &amp; \cos\phi\cos\theta &amp; -\sin\phi\cos\theta \\\\ 0 &amp; \sin\phi &amp; \cos\phi \end{bmatrix}$$</w:t>
       </w:r>
     </w:p>
     <w:p>
@@ -9184,7 +9072,7 @@
           <w:rFonts w:ascii="Arial" w:hAnsi="Arial"/>
           <w:sz w:val="20"/>
         </w:rPr>
-        <w:t>$$\mathbf{T}_\Theta(\boldsymbol{\eta}_2) = \begin{bmatrix} 1 &amp; \sin\phi\tan\theta &amp; \cos\phi\tan\theta \\ 0 &amp; \cos\phi &amp; -\sin\phi \\ 0 &amp; \frac{\sin\phi}{\cos\theta} &amp; \frac{\cos\phi}{\cos\theta} \end{bmatrix}$$</w:t>
+        <w:t>$$\mathbf{T}_\Theta(\boldsymbol{\eta}_2) = \begin{bmatrix} 1 &amp; \sin\phi\tan\theta &amp; \cos\phi\tan\theta \\\\ 0 &amp; \cos\phi &amp; -\sin\phi \\\\ 0 &amp; \frac{\sin\phi}{\cos\theta} &amp; \frac{\cos\phi}{\cos\theta} \end{bmatrix}$$</w:t>
       </w:r>
     </w:p>
     <w:p>
@@ -9630,7 +9518,7 @@
           <w:rFonts w:ascii="Arial" w:hAnsi="Arial"/>
           <w:sz w:val="20"/>
         </w:rPr>
-        <w:t>$$\mathbf{S}(\boldsymbol{\epsilon}) = \begin{bmatrix} 0 &amp; -\epsilon_3 &amp; \epsilon_2 \\ \epsilon_3 &amp; 0 &amp; -\epsilon_1 \\ -\epsilon_2 &amp; \epsilon_1 &amp; 0 \end{bmatrix}$$</w:t>
+        <w:t>$$\mathbf{S}(\boldsymbol{\epsilon}) = \begin{bmatrix} 0 &amp; -\epsilon_3 &amp; \epsilon_2 \\ \epsilon_3 &amp; 0 &amp; -\epsilon_1 \\\\ -\epsilon_2 &amp; \epsilon_1 &amp; 0 \end{bmatrix}$$</w:t>
       </w:r>
     </w:p>
     <w:p>
@@ -9730,114 +9618,16 @@
     </w:p>
     <w:p>
       <w:pPr>
-        <w:spacing w:after="80" w:line="276" w:lineRule="auto"/>
-        <w:ind w:firstLine="567"/>
-        <w:jc w:val="both"/>
-      </w:pPr>
-      <w:r>
-        <w:rPr>
-          <w:rFonts w:ascii="Arial" w:hAnsi="Arial"/>
-          <w:sz w:val="20"/>
-        </w:rPr>
-        <w:t>$$\begin{bmatrix} \dot{x} \\ \dot{y} \\ \dot{z} \\ \dot{\phi} \\ \dot{\theta} \\ \dot{\psi} \end{bmatrix} = \begin{bmatrix}</w:t>
-      </w:r>
-    </w:p>
-    <w:p>
-      <w:pPr>
-        <w:spacing w:after="80" w:line="276" w:lineRule="auto"/>
-        <w:ind w:firstLine="567"/>
-        <w:jc w:val="both"/>
-      </w:pPr>
-      <w:r>
-        <w:rPr>
-          <w:rFonts w:ascii="Arial" w:hAnsi="Arial"/>
-          <w:sz w:val="20"/>
-        </w:rPr>
-        <w:t>\cos\psi\cos\theta &amp; -\sin\psi\cos\phi + \cos\psi\sin\theta\sin\phi &amp; \sin\psi\sin\phi + \cos\psi\sin\theta\cos\phi &amp; 0 &amp; 0 &amp; 0 \\</w:t>
-      </w:r>
-    </w:p>
-    <w:p>
-      <w:pPr>
-        <w:spacing w:after="80" w:line="276" w:lineRule="auto"/>
-        <w:ind w:firstLine="567"/>
-        <w:jc w:val="both"/>
-      </w:pPr>
-      <w:r>
-        <w:rPr>
-          <w:rFonts w:ascii="Arial" w:hAnsi="Arial"/>
-          <w:sz w:val="20"/>
-        </w:rPr>
-        <w:t>\sin\psi\cos\theta &amp; \cos\psi\cos\phi + \sin\psi\sin\theta\sin\phi &amp; -\cos\psi\sin\phi + \sin\psi\sin\theta\cos\phi &amp; 0 &amp; 0 &amp; 0 \\</w:t>
-      </w:r>
-    </w:p>
-    <w:p>
-      <w:pPr>
-        <w:spacing w:after="80" w:line="276" w:lineRule="auto"/>
-        <w:ind w:firstLine="567"/>
-        <w:jc w:val="both"/>
-      </w:pPr>
-      <w:r>
-        <w:rPr>
-          <w:rFonts w:ascii="Arial" w:hAnsi="Arial"/>
-          <w:sz w:val="20"/>
-        </w:rPr>
-        <w:t>-\sin\theta &amp; \cos\theta\sin\phi &amp; \cos\theta\cos\phi &amp; 0 &amp; 0 &amp; 0 \\</w:t>
-      </w:r>
-    </w:p>
-    <w:p>
-      <w:pPr>
-        <w:spacing w:after="80" w:line="276" w:lineRule="auto"/>
-        <w:ind w:firstLine="567"/>
-        <w:jc w:val="both"/>
-      </w:pPr>
-      <w:r>
-        <w:rPr>
-          <w:rFonts w:ascii="Arial" w:hAnsi="Arial"/>
-          <w:sz w:val="20"/>
-        </w:rPr>
-        <w:t>0 &amp; 0 &amp; 0 &amp; 1 &amp; \sin\phi\tan\theta &amp; \cos\phi\tan\theta \\</w:t>
-      </w:r>
-    </w:p>
-    <w:p>
-      <w:pPr>
-        <w:spacing w:after="80" w:line="276" w:lineRule="auto"/>
-        <w:ind w:firstLine="567"/>
-        <w:jc w:val="both"/>
-      </w:pPr>
-      <w:r>
-        <w:rPr>
-          <w:rFonts w:ascii="Arial" w:hAnsi="Arial"/>
-          <w:sz w:val="20"/>
-        </w:rPr>
-        <w:t>0 &amp; 0 &amp; 0 &amp; 0 &amp; \cos\phi &amp; -\sin\phi \\</w:t>
-      </w:r>
-    </w:p>
-    <w:p>
-      <w:pPr>
-        <w:spacing w:after="80" w:line="276" w:lineRule="auto"/>
-        <w:ind w:firstLine="567"/>
-        <w:jc w:val="both"/>
-      </w:pPr>
-      <w:r>
-        <w:rPr>
-          <w:rFonts w:ascii="Arial" w:hAnsi="Arial"/>
-          <w:sz w:val="20"/>
-        </w:rPr>
-        <w:t>0 &amp; 0 &amp; 0 &amp; 0 &amp; \frac{\sin\phi}{\cos\theta} &amp; \frac{\cos\phi}{\cos\theta}</w:t>
-      </w:r>
-    </w:p>
-    <w:p>
-      <w:pPr>
-        <w:spacing w:after="80" w:line="276" w:lineRule="auto"/>
-        <w:ind w:firstLine="567"/>
-        <w:jc w:val="both"/>
-      </w:pPr>
-      <w:r>
-        <w:rPr>
-          <w:rFonts w:ascii="Arial" w:hAnsi="Arial"/>
-          <w:sz w:val="20"/>
-        </w:rPr>
-        <w:t>\end{bmatrix} \begin{bmatrix} u \\ v \\ w \\ p \\ q \\ r \end{bmatrix}$$</w:t>
+        <w:spacing w:before="120" w:after="120"/>
+        <w:ind w:firstLine="0"/>
+        <w:jc w:val="center"/>
+      </w:pPr>
+      <w:r>
+        <w:rPr>
+          <w:rFonts w:ascii="Arial" w:hAnsi="Arial"/>
+          <w:sz w:val="20"/>
+        </w:rPr>
+        <w:t>$$\begin{bmatrix} \dot{x} \\ \dot{y} \\ \dot{z} \\ \dot{\phi} \\ \dot{\theta} \\ \dot{\psi} \end{bmatrix} = \begin{bmatrix} \cos\psi\cos\theta &amp; -\sin\psi\cos\phi + \cos\psi\sin\theta\sin\phi &amp; \sin\psi\sin\phi + \cos\psi\sin\theta\cos\phi &amp; 0 &amp; 0 &amp; 0 \\\ \sin\psi\cos\theta &amp; \cos\psi\cos\phi + \sin\psi\sin\theta\sin\phi &amp; -\cos\psi\sin\phi + \sin\psi\sin\theta\cos\phi &amp; 0 &amp; 0 &amp; 0 \\\\ -\sin\theta &amp; \cos\theta\sin\phi &amp; \cos\theta\cos\phi &amp; 0 &amp; 0 &amp; 0 \\\\ 0 &amp; 0 &amp; 0 &amp; 1 &amp; \sin\phi\tan\theta &amp; \cos\phi\tan\theta \\\\ 0 &amp; 0 &amp; 0 &amp; 0 &amp; \cos\phi &amp; -\sin\phi \\\\ 0 &amp; 0 &amp; 0 &amp; 0 &amp; \frac{\sin\phi}{\cos\theta} &amp; \frac{\cos\phi}{\cos\theta} \end{bmatrix} \begin{bmatrix} u \\\\ v \\\\ w \\\\ p \\\\ q \\\\ r \end{bmatrix}$$</w:t>
       </w:r>
     </w:p>
     <w:p>
@@ -10259,7 +10049,7 @@
           <w:rFonts w:ascii="Arial" w:hAnsi="Arial"/>
           <w:sz w:val="20"/>
         </w:rPr>
-        <w:t>$$\mathbf{M}_{RB} = \begin{bmatrix} m\mathbf{I}_{3 \times 3} &amp; -m\mathbf{S}(\mathbf{r}_g) \\ m\mathbf{S}(\mathbf{r}_g) &amp; \mathbf{I}_g - m\mathbf{S}^2(\mathbf{r}_g) \end{bmatrix} \in \mathbb{R}^{6 \times 6}$$</w:t>
+        <w:t>$$\mathbf{M}_{RB} = \begin{bmatrix} m\mathbf{I}_{3 \times 3} &amp; -m\mathbf{S}(\mathbf{r}_g) \\\\ m\mathbf{S}(\mathbf{r}_g) &amp; \mathbf{I}_g - m\mathbf{S}^2(\mathbf{r}_g) \end{bmatrix} \in \mathbb{R}^{6 \times 6}$$</w:t>
       </w:r>
     </w:p>
     <w:p>
@@ -10330,7 +10120,7 @@
           <w:rFonts w:ascii="Arial" w:hAnsi="Arial"/>
           <w:sz w:val="20"/>
         </w:rPr>
-        <w:t>$$\mathbf{S}(\mathbf{r}_g) = \begin{bmatrix} 0 &amp; -z_g &amp; y_g \\ z_g &amp; 0 &amp; -x_g \\ -y_g &amp; x_g &amp; 0 \end{bmatrix}$$</w:t>
+        <w:t>$$\mathbf{S}(\mathbf{r}_g) = \begin{bmatrix} 0 &amp; -z_g &amp; y_g \\\\ z_g &amp; 0 &amp; -x_g \\\\ -y_g &amp; x_g &amp; 0 \end{bmatrix}$$</w:t>
       </w:r>
     </w:p>
     <w:p>
@@ -10358,7 +10148,7 @@
           <w:rFonts w:ascii="Arial" w:hAnsi="Arial"/>
           <w:sz w:val="20"/>
         </w:rPr>
-        <w:t>$$\mathbf{I}_g = \begin{bmatrix} I_{xx} &amp; -I_{xy} &amp; -I_{xz} \\ -I_{xy} &amp; I_{yy} -I_{yz} \\ -I_{xz} &amp; -I_{yz} &amp; I_{zz} \end{bmatrix}$$</w:t>
+        <w:t>$$\mathbf{I}_g = \begin{bmatrix} I_{xx} &amp; -I_{xy} &amp; -I_{xz} \\\\ -I_{xy} &amp; I_{yy} -I_{yz} \\\\ -I_{xz} &amp; -I_{yz} &amp; I_{zz} \end{bmatrix}$$</w:t>
       </w:r>
     </w:p>
     <w:p>
@@ -10430,7 +10220,7 @@
           <w:rFonts w:ascii="Arial" w:hAnsi="Arial"/>
           <w:sz w:val="20"/>
         </w:rPr>
-        <w:t>$$-\mathbf{S}^2(\mathbf{r}_g) = \begin{bmatrix} y_g^2 + z_g^2 &amp; -x_g y_g &amp; -x_g z_g \\ -x_g y_g &amp; x_g^2 + z_g^2 &amp; -y_g z_g \\ -x_g z_g &amp; -y_g z_g &amp; x_g^2 + y_g^2 \end{bmatrix}$$</w:t>
+        <w:t>$$-\mathbf{S}^2(\mathbf{r}_g) = \begin{bmatrix} y_g^2 + z_g^2 &amp; -x_g y_g &amp; -x_g z_g \\\\ -x_g y_g &amp; x_g^2 + z_g^2 &amp; -y_g z_g \\\\ -x_g z_g &amp; -y_g z_g &amp; x_g^2 + y_g^2 \end{bmatrix}$$</w:t>
       </w:r>
     </w:p>
     <w:p>
@@ -10477,114 +10267,16 @@
     </w:p>
     <w:p>
       <w:pPr>
-        <w:spacing w:after="80" w:line="276" w:lineRule="auto"/>
-        <w:ind w:firstLine="567"/>
-        <w:jc w:val="both"/>
-      </w:pPr>
-      <w:r>
-        <w:rPr>
-          <w:rFonts w:ascii="Arial" w:hAnsi="Arial"/>
-          <w:sz w:val="20"/>
-        </w:rPr>
-        <w:t>$$\mathbf{M}_{RB} = \begin{bmatrix}</w:t>
-      </w:r>
-    </w:p>
-    <w:p>
-      <w:pPr>
-        <w:spacing w:after="80" w:line="276" w:lineRule="auto"/>
-        <w:ind w:firstLine="567"/>
-        <w:jc w:val="both"/>
-      </w:pPr>
-      <w:r>
-        <w:rPr>
-          <w:rFonts w:ascii="Arial" w:hAnsi="Arial"/>
-          <w:sz w:val="20"/>
-        </w:rPr>
-        <w:t>m &amp; 0 &amp; 0 &amp; 0 &amp; m z_g &amp; 0 \\</w:t>
-      </w:r>
-    </w:p>
-    <w:p>
-      <w:pPr>
-        <w:spacing w:after="80" w:line="276" w:lineRule="auto"/>
-        <w:ind w:firstLine="567"/>
-        <w:jc w:val="both"/>
-      </w:pPr>
-      <w:r>
-        <w:rPr>
-          <w:rFonts w:ascii="Arial" w:hAnsi="Arial"/>
-          <w:sz w:val="20"/>
-        </w:rPr>
-        <w:t>0 &amp; m &amp; 0 &amp; -m z_g &amp; 0 &amp; 0 \\</w:t>
-      </w:r>
-    </w:p>
-    <w:p>
-      <w:pPr>
-        <w:spacing w:after="80" w:line="276" w:lineRule="auto"/>
-        <w:ind w:firstLine="567"/>
-        <w:jc w:val="both"/>
-      </w:pPr>
-      <w:r>
-        <w:rPr>
-          <w:rFonts w:ascii="Arial" w:hAnsi="Arial"/>
-          <w:sz w:val="20"/>
-        </w:rPr>
-        <w:t>0 &amp; 0 &amp; m &amp; 0 &amp; 0 &amp; 0 \\</w:t>
-      </w:r>
-    </w:p>
-    <w:p>
-      <w:pPr>
-        <w:spacing w:after="80" w:line="276" w:lineRule="auto"/>
-        <w:ind w:firstLine="567"/>
-        <w:jc w:val="both"/>
-      </w:pPr>
-      <w:r>
-        <w:rPr>
-          <w:rFonts w:ascii="Arial" w:hAnsi="Arial"/>
-          <w:sz w:val="20"/>
-        </w:rPr>
-        <w:t>0 &amp; -m z_g &amp; 0 &amp; I_{xx} + m z_g^2 &amp; 0 &amp; 0 \\</w:t>
-      </w:r>
-    </w:p>
-    <w:p>
-      <w:pPr>
-        <w:spacing w:after="80" w:line="276" w:lineRule="auto"/>
-        <w:ind w:firstLine="567"/>
-        <w:jc w:val="both"/>
-      </w:pPr>
-      <w:r>
-        <w:rPr>
-          <w:rFonts w:ascii="Arial" w:hAnsi="Arial"/>
-          <w:sz w:val="20"/>
-        </w:rPr>
-        <w:t>m z_g &amp; 0 &amp; 0 &amp; 0 &amp; I_{yy} + m z_g^2 &amp; 0 \\</w:t>
-      </w:r>
-    </w:p>
-    <w:p>
-      <w:pPr>
-        <w:spacing w:after="80" w:line="276" w:lineRule="auto"/>
-        <w:ind w:firstLine="567"/>
-        <w:jc w:val="both"/>
-      </w:pPr>
-      <w:r>
-        <w:rPr>
-          <w:rFonts w:ascii="Arial" w:hAnsi="Arial"/>
-          <w:sz w:val="20"/>
-        </w:rPr>
-        <w:t>0 &amp; 0 &amp; 0 &amp; 0 &amp; 0 &amp; I_{zz}</w:t>
-      </w:r>
-    </w:p>
-    <w:p>
-      <w:pPr>
-        <w:spacing w:after="80" w:line="276" w:lineRule="auto"/>
-        <w:ind w:firstLine="567"/>
-        <w:jc w:val="both"/>
-      </w:pPr>
-      <w:r>
-        <w:rPr>
-          <w:rFonts w:ascii="Arial" w:hAnsi="Arial"/>
-          <w:sz w:val="20"/>
-        </w:rPr>
-        <w:t>\end{bmatrix}$$</w:t>
+        <w:spacing w:before="120" w:after="120"/>
+        <w:ind w:firstLine="0"/>
+        <w:jc w:val="center"/>
+      </w:pPr>
+      <w:r>
+        <w:rPr>
+          <w:rFonts w:ascii="Arial" w:hAnsi="Arial"/>
+          <w:sz w:val="20"/>
+        </w:rPr>
+        <w:t>$$\mathbf{M}_{RB} = \begin{bmatrix} m &amp; 0 &amp; 0 &amp; 0 &amp; m z_g &amp; 0 \\\\ 0 &amp; m &amp; 0 &amp; -m z_g &amp; 0 &amp; 0 \\\\ 0 &amp; 0 &amp; m &amp; 0 &amp; 0 &amp; 0 \\\\ 0 &amp; -m z_g &amp; 0 &amp; I_{xx} + m z_g^2 &amp; 0 &amp; 0 \\\\ m z_g &amp; 0 &amp; 0 &amp; 0 &amp; I_{yy} + m z_g^2 &amp; 0 \\\\ 0 &amp; 0 &amp; 0 &amp; 0 &amp; 0 &amp; I_{zz} \end{bmatrix}$$</w:t>
       </w:r>
     </w:p>
     <w:p>
@@ -10756,114 +10448,16 @@
     </w:p>
     <w:p>
       <w:pPr>
-        <w:spacing w:after="80" w:line="276" w:lineRule="auto"/>
-        <w:ind w:firstLine="567"/>
-        <w:jc w:val="both"/>
-      </w:pPr>
-      <w:r>
-        <w:rPr>
-          <w:rFonts w:ascii="Arial" w:hAnsi="Arial"/>
-          <w:sz w:val="20"/>
-        </w:rPr>
-        <w:t>$$\mathbf{M}_A = -\begin{bmatrix}</w:t>
-      </w:r>
-    </w:p>
-    <w:p>
-      <w:pPr>
-        <w:spacing w:after="80" w:line="276" w:lineRule="auto"/>
-        <w:ind w:firstLine="567"/>
-        <w:jc w:val="both"/>
-      </w:pPr>
-      <w:r>
-        <w:rPr>
-          <w:rFonts w:ascii="Arial" w:hAnsi="Arial"/>
-          <w:sz w:val="20"/>
-        </w:rPr>
-        <w:t>X_{\dot{u}} &amp; X_{\dot{v}} &amp; X_{\dot{w}} &amp; X_{\dot{p}} &amp; X_{\dot{q}} &amp; X_{\dot{r}} \\</w:t>
-      </w:r>
-    </w:p>
-    <w:p>
-      <w:pPr>
-        <w:spacing w:after="80" w:line="276" w:lineRule="auto"/>
-        <w:ind w:firstLine="567"/>
-        <w:jc w:val="both"/>
-      </w:pPr>
-      <w:r>
-        <w:rPr>
-          <w:rFonts w:ascii="Arial" w:hAnsi="Arial"/>
-          <w:sz w:val="20"/>
-        </w:rPr>
-        <w:t>Y_{\dot{u}} &amp; Y_{\dot{v}} &amp; Y_{\dot{w}} &amp; Y_{\dot{p}} &amp; Y_{\dot{q}} &amp; Y_{\dot{r}} \\</w:t>
-      </w:r>
-    </w:p>
-    <w:p>
-      <w:pPr>
-        <w:spacing w:after="80" w:line="276" w:lineRule="auto"/>
-        <w:ind w:firstLine="567"/>
-        <w:jc w:val="both"/>
-      </w:pPr>
-      <w:r>
-        <w:rPr>
-          <w:rFonts w:ascii="Arial" w:hAnsi="Arial"/>
-          <w:sz w:val="20"/>
-        </w:rPr>
-        <w:t>Z_{\dot{u}} &amp; Z_{\dot{v}} &amp; Z_{\dot{w}} &amp; Z_{\dot{p}} &amp; Z_{\dot{q}} &amp; Z_{\dot{r}} \\</w:t>
-      </w:r>
-    </w:p>
-    <w:p>
-      <w:pPr>
-        <w:spacing w:after="80" w:line="276" w:lineRule="auto"/>
-        <w:ind w:firstLine="567"/>
-        <w:jc w:val="both"/>
-      </w:pPr>
-      <w:r>
-        <w:rPr>
-          <w:rFonts w:ascii="Arial" w:hAnsi="Arial"/>
-          <w:sz w:val="20"/>
-        </w:rPr>
-        <w:t>K_{\dot{u}} &amp; K_{\dot{v}} &amp; K_{\dot{w}} &amp; K_{\dot{p}} &amp; K_{\dot{q}} &amp; K_{\dot{r}} \\</w:t>
-      </w:r>
-    </w:p>
-    <w:p>
-      <w:pPr>
-        <w:spacing w:after="80" w:line="276" w:lineRule="auto"/>
-        <w:ind w:firstLine="567"/>
-        <w:jc w:val="both"/>
-      </w:pPr>
-      <w:r>
-        <w:rPr>
-          <w:rFonts w:ascii="Arial" w:hAnsi="Arial"/>
-          <w:sz w:val="20"/>
-        </w:rPr>
-        <w:t>M_{\dot{u}} &amp; M_{\dot{v}} &amp; M_{\dot{w}} &amp; M_{\dot{p}} &amp; M_{\dot{q}} &amp; M_{\dot{r}} \\</w:t>
-      </w:r>
-    </w:p>
-    <w:p>
-      <w:pPr>
-        <w:spacing w:after="80" w:line="276" w:lineRule="auto"/>
-        <w:ind w:firstLine="567"/>
-        <w:jc w:val="both"/>
-      </w:pPr>
-      <w:r>
-        <w:rPr>
-          <w:rFonts w:ascii="Arial" w:hAnsi="Arial"/>
-          <w:sz w:val="20"/>
-        </w:rPr>
-        <w:t>N_{\dot{u}} &amp; N_{\dot{v}} &amp; N_{\dot{w}} &amp; N_{\dot{p}} &amp; N_{\dot{q}} &amp; N_{\dot{r}}</w:t>
-      </w:r>
-    </w:p>
-    <w:p>
-      <w:pPr>
-        <w:spacing w:after="80" w:line="276" w:lineRule="auto"/>
-        <w:ind w:firstLine="567"/>
-        <w:jc w:val="both"/>
-      </w:pPr>
-      <w:r>
-        <w:rPr>
-          <w:rFonts w:ascii="Arial" w:hAnsi="Arial"/>
-          <w:sz w:val="20"/>
-        </w:rPr>
-        <w:t>\end{bmatrix}$$</w:t>
+        <w:spacing w:before="120" w:after="120"/>
+        <w:ind w:firstLine="0"/>
+        <w:jc w:val="center"/>
+      </w:pPr>
+      <w:r>
+        <w:rPr>
+          <w:rFonts w:ascii="Arial" w:hAnsi="Arial"/>
+          <w:sz w:val="20"/>
+        </w:rPr>
+        <w:t>$$\mathbf{M}_A = -\begin{bmatrix} X_{\dot{u}} &amp; X_{\dot{v}} &amp; X_{\dot{w}} &amp; X_{\dot{p}} &amp; X_{\dot{q}} &amp; X_{\dot{r}} \\\\ Y_{\dot{u}} &amp; Y_{\dot{v}} &amp; Y_{\dot{w}} &amp; Y_{\dot{p}} &amp; Y_{\dot{q}} &amp; Y_{\dot{r}} \\\\ Z_{\dot{u}} &amp; Z_{\dot{v}} &amp; Z_{\dot{w}} &amp; Z_{\dot{p}} &amp; Z_{\dot{q}} &amp; Z_{\dot{r}} \\\\ K_{\dot{u}} &amp; K_{\dot{v}} &amp; K_{\dot{w}} &amp; K_{\dot{p}} &amp; K_{\dot{q}} &amp; K_{\dot{r}} \\\\ M_{\dot{u}} &amp; M_{\dot{v}} &amp; M_{\dot{w}} &amp; M_{\dot{p}} &amp; M_{\dot{q}} &amp; M_{\dot{r}} \\\\ N_{\dot{u}} &amp; N_{\dot{v}} &amp; N_{\dot{w}} &amp; N_{\dot{p}} &amp; N_{\dot{q}} &amp; N_{\dot{r}} \end{bmatrix}$$</w:t>
       </w:r>
     </w:p>
     <w:p>
@@ -11195,7 +10789,7 @@
           <w:rFonts w:ascii="Arial" w:hAnsi="Arial"/>
           <w:sz w:val="20"/>
         </w:rPr>
-        <w:t>$$\mathbf{C}_{RB}(\boldsymbol{\nu}) = \begin{bmatrix} \mathbf{0}_{3 \times 3} &amp; -\mathbf{S}(\mathbf{M}_{RB,11}\boldsymbol{\nu}_1 + \mathbf{M}_{RB,12}\boldsymbol{\nu}_2) \\ -\mathbf{S}(\mathbf{M}_{RB,11}\boldsymbol{\nu}_1 + \mathbf{M}_{RB,12}\boldsymbol{\nu}_2) &amp; -\mathbf{S}(\mathbf{M}_{RB,21}\boldsymbol{\nu}_1 + \mathbf{M}_{RB,22}\boldsymbol{\nu}_2) \end{bmatrix}$$</w:t>
+        <w:t>$$\mathbf{C}_{RB}(\boldsymbol{\nu}) = \begin{bmatrix} \mathbf{0}_{3 \times 3} &amp; -\mathbf{S}(\mathbf{M}_{RB,11}\boldsymbol{\nu}_1 + \mathbf{M}_{RB,12}\boldsymbol{\nu}_2) \\\\ -\mathbf{S}(\mathbf{M}_{RB,11}\boldsymbol{\nu}_1 + \mathbf{M}_{RB,12}\boldsymbol{\nu}_2) &amp; -\mathbf{S}(\mathbf{M}_{RB,21}\boldsymbol{\nu}_1 + \mathbf{M}_{RB,22}\boldsymbol{\nu}_2) \end{bmatrix}$$</w:t>
       </w:r>
     </w:p>
     <w:p>
@@ -11228,114 +10822,16 @@
     </w:p>
     <w:p>
       <w:pPr>
-        <w:spacing w:after="80" w:line="276" w:lineRule="auto"/>
-        <w:ind w:firstLine="567"/>
-        <w:jc w:val="both"/>
-      </w:pPr>
-      <w:r>
-        <w:rPr>
-          <w:rFonts w:ascii="Arial" w:hAnsi="Arial"/>
-          <w:sz w:val="20"/>
-        </w:rPr>
-        <w:t>$$\mathbf{C}_{RB}(\boldsymbol{\nu}) = \begin{bmatrix}</w:t>
-      </w:r>
-    </w:p>
-    <w:p>
-      <w:pPr>
-        <w:spacing w:after="80" w:line="276" w:lineRule="auto"/>
-        <w:ind w:firstLine="567"/>
-        <w:jc w:val="both"/>
-      </w:pPr>
-      <w:r>
-        <w:rPr>
-          <w:rFonts w:ascii="Arial" w:hAnsi="Arial"/>
-          <w:sz w:val="20"/>
-        </w:rPr>
-        <w:t>0 &amp; 0 &amp; 0 &amp; 0 &amp; mw &amp; -mv \\</w:t>
-      </w:r>
-    </w:p>
-    <w:p>
-      <w:pPr>
-        <w:spacing w:after="80" w:line="276" w:lineRule="auto"/>
-        <w:ind w:firstLine="567"/>
-        <w:jc w:val="both"/>
-      </w:pPr>
-      <w:r>
-        <w:rPr>
-          <w:rFonts w:ascii="Arial" w:hAnsi="Arial"/>
-          <w:sz w:val="20"/>
-        </w:rPr>
-        <w:t>0 &amp; 0 &amp; 0 &amp; -mw &amp; 0 &amp; mu \\</w:t>
-      </w:r>
-    </w:p>
-    <w:p>
-      <w:pPr>
-        <w:spacing w:after="80" w:line="276" w:lineRule="auto"/>
-        <w:ind w:firstLine="567"/>
-        <w:jc w:val="both"/>
-      </w:pPr>
-      <w:r>
-        <w:rPr>
-          <w:rFonts w:ascii="Arial" w:hAnsi="Arial"/>
-          <w:sz w:val="20"/>
-        </w:rPr>
-        <w:t>0 &amp; 0 &amp; 0 &amp; mv &amp; -mu &amp; 0 \\</w:t>
-      </w:r>
-    </w:p>
-    <w:p>
-      <w:pPr>
-        <w:spacing w:after="80" w:line="276" w:lineRule="auto"/>
-        <w:ind w:firstLine="567"/>
-        <w:jc w:val="both"/>
-      </w:pPr>
-      <w:r>
-        <w:rPr>
-          <w:rFonts w:ascii="Arial" w:hAnsi="Arial"/>
-          <w:sz w:val="20"/>
-        </w:rPr>
-        <w:t>0 &amp; mw &amp; -mv &amp; 0 &amp; I_{zz}r &amp; -I_{yy}q \\</w:t>
-      </w:r>
-    </w:p>
-    <w:p>
-      <w:pPr>
-        <w:spacing w:after="80" w:line="276" w:lineRule="auto"/>
-        <w:ind w:firstLine="567"/>
-        <w:jc w:val="both"/>
-      </w:pPr>
-      <w:r>
-        <w:rPr>
-          <w:rFonts w:ascii="Arial" w:hAnsi="Arial"/>
-          <w:sz w:val="20"/>
-        </w:rPr>
-        <w:t>-mw &amp; 0 &amp; mu &amp; -I_{zz}r &amp; 0 &amp; I_{xx}p \\</w:t>
-      </w:r>
-    </w:p>
-    <w:p>
-      <w:pPr>
-        <w:spacing w:after="80" w:line="276" w:lineRule="auto"/>
-        <w:ind w:firstLine="567"/>
-        <w:jc w:val="both"/>
-      </w:pPr>
-      <w:r>
-        <w:rPr>
-          <w:rFonts w:ascii="Arial" w:hAnsi="Arial"/>
-          <w:sz w:val="20"/>
-        </w:rPr>
-        <w:t>mv &amp; -mu &amp; 0 &amp; I_{yy}q &amp; -I_{xx}p &amp; 0</w:t>
-      </w:r>
-    </w:p>
-    <w:p>
-      <w:pPr>
-        <w:spacing w:after="80" w:line="276" w:lineRule="auto"/>
-        <w:ind w:firstLine="567"/>
-        <w:jc w:val="both"/>
-      </w:pPr>
-      <w:r>
-        <w:rPr>
-          <w:rFonts w:ascii="Arial" w:hAnsi="Arial"/>
-          <w:sz w:val="20"/>
-        </w:rPr>
-        <w:t>\end{bmatrix}$$</w:t>
+        <w:spacing w:before="120" w:after="120"/>
+        <w:ind w:firstLine="0"/>
+        <w:jc w:val="center"/>
+      </w:pPr>
+      <w:r>
+        <w:rPr>
+          <w:rFonts w:ascii="Arial" w:hAnsi="Arial"/>
+          <w:sz w:val="20"/>
+        </w:rPr>
+        <w:t>$$\mathbf{C}_{RB}(\boldsymbol{\nu}) = \begin{bmatrix} 0 &amp; 0 &amp; 0 &amp; 0 &amp; mw &amp; -mv \\\\ 0 &amp; 0 &amp; 0 &amp; -mw &amp; 0 &amp; mu \\\\ 0 &amp; 0 &amp; 0 &amp; mv &amp; -mu &amp; 0 \\\\ 0 &amp; mw &amp; -mv &amp; 0 &amp; I_{zz}r &amp; -I_{yy}q \\\\ -mw &amp; 0 &amp; mu &amp; -I_{zz}r &amp; 0 &amp; I_{xx}p \\\\ mv &amp; -mu &amp; 0 &amp; I_{yy}q &amp; -I_{xx}p &amp; 0 \end{bmatrix}$$</w:t>
       </w:r>
     </w:p>
     <w:p>
@@ -11388,7 +10884,7 @@
           <w:rFonts w:ascii="Arial" w:hAnsi="Arial"/>
           <w:sz w:val="20"/>
         </w:rPr>
-        <w:t>$$\mathbf{C}_A(\boldsymbol{\nu}_r) = \begin{bmatrix} \mathbf{0}_{3 \times 3} &amp; -\mathbf{S}(\mathbf{M}_{A,11}\boldsymbol{\nu}_{r,1} + \mathbf{M}_{A,12}\boldsymbol{\nu}_{r,2}) \\ -\mathbf{S}(\mathbf{M}_{A,11}\boldsymbol{\nu}_{r,1} + \mathbf{M}_{A,12}\boldsymbol{\nu}_{r,2}) &amp; -\mathbf{S}(\mathbf{M}_{A,21}\boldsymbol{\nu}_{r,1} + \mathbf{M}_{A,22}\boldsymbol{\nu}_{r,2}) \end{bmatrix}$$</w:t>
+        <w:t>$$\mathbf{C}_A(\boldsymbol{\nu}_r) = \begin{bmatrix} \mathbf{0}_{3 \times 3} &amp; -\mathbf{S}(\mathbf{M}_{A,11}\boldsymbol{\nu}_{r,1} + \mathbf{M}_{A,12}\boldsymbol{\nu}_{r,2}) \\\\ -\mathbf{S}(\mathbf{M}_{A,11}\boldsymbol{\nu}_{r,1} + \mathbf{M}_{A,12}\boldsymbol{\nu}_{r,2}) &amp; -\mathbf{S}(\mathbf{M}_{A,21}\boldsymbol{\nu}_{r,1} + \mathbf{M}_{A,22}\boldsymbol{\nu}_{r,2}) \end{bmatrix}$$</w:t>
       </w:r>
     </w:p>
     <w:p>
@@ -11407,114 +10903,16 @@
     </w:p>
     <w:p>
       <w:pPr>
-        <w:spacing w:after="80" w:line="276" w:lineRule="auto"/>
-        <w:ind w:firstLine="567"/>
-        <w:jc w:val="both"/>
-      </w:pPr>
-      <w:r>
-        <w:rPr>
-          <w:rFonts w:ascii="Arial" w:hAnsi="Arial"/>
-          <w:sz w:val="20"/>
-        </w:rPr>
-        <w:t>$$\mathbf{C}_A(\boldsymbol{\nu}_r) = \begin{bmatrix}</w:t>
-      </w:r>
-    </w:p>
-    <w:p>
-      <w:pPr>
-        <w:spacing w:after="80" w:line="276" w:lineRule="auto"/>
-        <w:ind w:firstLine="567"/>
-        <w:jc w:val="both"/>
-      </w:pPr>
-      <w:r>
-        <w:rPr>
-          <w:rFonts w:ascii="Arial" w:hAnsi="Arial"/>
-          <w:sz w:val="20"/>
-        </w:rPr>
-        <w:t>0 &amp; 0 &amp; 0 &amp; 0 &amp; -Z_{\dot{w}}w_r &amp; Y_{\dot{v}}v_r \\</w:t>
-      </w:r>
-    </w:p>
-    <w:p>
-      <w:pPr>
-        <w:spacing w:after="80" w:line="276" w:lineRule="auto"/>
-        <w:ind w:firstLine="567"/>
-        <w:jc w:val="both"/>
-      </w:pPr>
-      <w:r>
-        <w:rPr>
-          <w:rFonts w:ascii="Arial" w:hAnsi="Arial"/>
-          <w:sz w:val="20"/>
-        </w:rPr>
-        <w:t>0 &amp; 0 &amp; 0 &amp; Z_{\dot{w}}w_r &amp; 0 &amp; -X_{\dot{u}}u_r \\</w:t>
-      </w:r>
-    </w:p>
-    <w:p>
-      <w:pPr>
-        <w:spacing w:after="80" w:line="276" w:lineRule="auto"/>
-        <w:ind w:firstLine="567"/>
-        <w:jc w:val="both"/>
-      </w:pPr>
-      <w:r>
-        <w:rPr>
-          <w:rFonts w:ascii="Arial" w:hAnsi="Arial"/>
-          <w:sz w:val="20"/>
-        </w:rPr>
-        <w:t>0 &amp; 0 &amp; 0 &amp; -Y_{\dot{v}}v_r &amp; X_{\dot{u}}u_r &amp; 0 \\</w:t>
-      </w:r>
-    </w:p>
-    <w:p>
-      <w:pPr>
-        <w:spacing w:after="80" w:line="276" w:lineRule="auto"/>
-        <w:ind w:firstLine="567"/>
-        <w:jc w:val="both"/>
-      </w:pPr>
-      <w:r>
-        <w:rPr>
-          <w:rFonts w:ascii="Arial" w:hAnsi="Arial"/>
-          <w:sz w:val="20"/>
-        </w:rPr>
-        <w:t>0 &amp; -Z_{\dot{w}}w_r &amp; Y_{\dot{v}}v_r &amp; 0 &amp; -N_{\dot{r}}r &amp; M_{\dot{q}}q \\</w:t>
-      </w:r>
-    </w:p>
-    <w:p>
-      <w:pPr>
-        <w:spacing w:after="80" w:line="276" w:lineRule="auto"/>
-        <w:ind w:firstLine="567"/>
-        <w:jc w:val="both"/>
-      </w:pPr>
-      <w:r>
-        <w:rPr>
-          <w:rFonts w:ascii="Arial" w:hAnsi="Arial"/>
-          <w:sz w:val="20"/>
-        </w:rPr>
-        <w:t>Z_{\dot{w}}w_r &amp; 0 &amp; -X_{\dot{u}}u_r &amp; N_{\dot{r}}r &amp; 0 &amp; -K_{\dot{p}}p \\</w:t>
-      </w:r>
-    </w:p>
-    <w:p>
-      <w:pPr>
-        <w:spacing w:after="80" w:line="276" w:lineRule="auto"/>
-        <w:ind w:firstLine="567"/>
-        <w:jc w:val="both"/>
-      </w:pPr>
-      <w:r>
-        <w:rPr>
-          <w:rFonts w:ascii="Arial" w:hAnsi="Arial"/>
-          <w:sz w:val="20"/>
-        </w:rPr>
-        <w:t>-Y_{\dot{v}}v_r &amp; X_{\dot{u}}u_r &amp; 0 &amp; -M_{\dot{q}}q &amp; K_{\dot{p}}p &amp; 0</w:t>
-      </w:r>
-    </w:p>
-    <w:p>
-      <w:pPr>
-        <w:spacing w:after="80" w:line="276" w:lineRule="auto"/>
-        <w:ind w:firstLine="567"/>
-        <w:jc w:val="both"/>
-      </w:pPr>
-      <w:r>
-        <w:rPr>
-          <w:rFonts w:ascii="Arial" w:hAnsi="Arial"/>
-          <w:sz w:val="20"/>
-        </w:rPr>
-        <w:t>\end{bmatrix}$$</w:t>
+        <w:spacing w:before="120" w:after="120"/>
+        <w:ind w:firstLine="0"/>
+        <w:jc w:val="center"/>
+      </w:pPr>
+      <w:r>
+        <w:rPr>
+          <w:rFonts w:ascii="Arial" w:hAnsi="Arial"/>
+          <w:sz w:val="20"/>
+        </w:rPr>
+        <w:t>$$\mathbf{C}_A(\boldsymbol{\nu}_r) = \begin{bmatrix} 0 &amp; 0 &amp; 0 &amp; 0 &amp; -Z_{\dot{w}}w_r &amp; Y_{\dot{v}}v_r \\\\ 0 &amp; 0 &amp; 0 &amp; Z_{\dot{w}}w_r &amp; 0 &amp; -X_{\dot{u}}u_r \\\\ 0 &amp; 0 &amp; 0 &amp; -Y_{\dot{v}}v_r &amp; X_{\dot{u}}u_r &amp; 0 \\\\ 0 &amp; -Z_{\dot{w}}w_r &amp; Y_{\dot{v}}v_r &amp; 0 &amp; -N_{\dot{r}}r &amp; M_{\dot{q}}q \\\\ Z_{\dot{w}}w_r &amp; 0 &amp; -X_{\dot{u}}u_r &amp; N_{\dot{r}}r &amp; 0 &amp; -K_{\dot{p}}p \\\\ -Y_{\dot{v}}v_r &amp; X_{\dot{u}}u_r &amp; 0 &amp; -M_{\dot{q}}q &amp; K_{\dot{p}}p &amp; 0 \end{bmatrix}$$</w:t>
       </w:r>
     </w:p>
     <w:p>
@@ -12398,114 +11796,16 @@
     </w:p>
     <w:p>
       <w:pPr>
-        <w:spacing w:after="80" w:line="276" w:lineRule="auto"/>
-        <w:ind w:firstLine="567"/>
-        <w:jc w:val="both"/>
-      </w:pPr>
-      <w:r>
-        <w:rPr>
-          <w:rFonts w:ascii="Arial" w:hAnsi="Arial"/>
-          <w:sz w:val="20"/>
-        </w:rPr>
-        <w:t>$$\mathbf{D}(\boldsymbol{\nu}_r)\boldsymbol{\nu}_r = \begin{bmatrix}</w:t>
-      </w:r>
-    </w:p>
-    <w:p>
-      <w:pPr>
-        <w:spacing w:after="80" w:line="276" w:lineRule="auto"/>
-        <w:ind w:firstLine="567"/>
-        <w:jc w:val="both"/>
-      </w:pPr>
-      <w:r>
-        <w:rPr>
-          <w:rFonts w:ascii="Arial" w:hAnsi="Arial"/>
-          <w:sz w:val="20"/>
-        </w:rPr>
-        <w:t>-(X_u + X_{u|u|}|u_r|)u_r \\</w:t>
-      </w:r>
-    </w:p>
-    <w:p>
-      <w:pPr>
-        <w:spacing w:after="80" w:line="276" w:lineRule="auto"/>
-        <w:ind w:firstLine="567"/>
-        <w:jc w:val="both"/>
-      </w:pPr>
-      <w:r>
-        <w:rPr>
-          <w:rFonts w:ascii="Arial" w:hAnsi="Arial"/>
-          <w:sz w:val="20"/>
-        </w:rPr>
-        <w:t>-(Y_v + Y_{v|v|}|v_r|)v_r \\</w:t>
-      </w:r>
-    </w:p>
-    <w:p>
-      <w:pPr>
-        <w:spacing w:after="80" w:line="276" w:lineRule="auto"/>
-        <w:ind w:firstLine="567"/>
-        <w:jc w:val="both"/>
-      </w:pPr>
-      <w:r>
-        <w:rPr>
-          <w:rFonts w:ascii="Arial" w:hAnsi="Arial"/>
-          <w:sz w:val="20"/>
-        </w:rPr>
-        <w:t>-(Z_w + Z_{w|w|}|w_r|)w_r \\</w:t>
-      </w:r>
-    </w:p>
-    <w:p>
-      <w:pPr>
-        <w:spacing w:after="80" w:line="276" w:lineRule="auto"/>
-        <w:ind w:firstLine="567"/>
-        <w:jc w:val="both"/>
-      </w:pPr>
-      <w:r>
-        <w:rPr>
-          <w:rFonts w:ascii="Arial" w:hAnsi="Arial"/>
-          <w:sz w:val="20"/>
-        </w:rPr>
-        <w:t>-(K_p + K_{p|p|}|p|)p \\</w:t>
-      </w:r>
-    </w:p>
-    <w:p>
-      <w:pPr>
-        <w:spacing w:after="80" w:line="276" w:lineRule="auto"/>
-        <w:ind w:firstLine="567"/>
-        <w:jc w:val="both"/>
-      </w:pPr>
-      <w:r>
-        <w:rPr>
-          <w:rFonts w:ascii="Arial" w:hAnsi="Arial"/>
-          <w:sz w:val="20"/>
-        </w:rPr>
-        <w:t>-(M_q + M_{q|q|}|q|)q \\</w:t>
-      </w:r>
-    </w:p>
-    <w:p>
-      <w:pPr>
-        <w:spacing w:after="80" w:line="276" w:lineRule="auto"/>
-        <w:ind w:firstLine="567"/>
-        <w:jc w:val="both"/>
-      </w:pPr>
-      <w:r>
-        <w:rPr>
-          <w:rFonts w:ascii="Arial" w:hAnsi="Arial"/>
-          <w:sz w:val="20"/>
-        </w:rPr>
-        <w:t>-(N_r + N_{r|r|}|r|)r</w:t>
-      </w:r>
-    </w:p>
-    <w:p>
-      <w:pPr>
-        <w:spacing w:after="80" w:line="276" w:lineRule="auto"/>
-        <w:ind w:firstLine="567"/>
-        <w:jc w:val="both"/>
-      </w:pPr>
-      <w:r>
-        <w:rPr>
-          <w:rFonts w:ascii="Arial" w:hAnsi="Arial"/>
-          <w:sz w:val="20"/>
-        </w:rPr>
-        <w:t>\end{bmatrix}$$</w:t>
+        <w:spacing w:before="120" w:after="120"/>
+        <w:ind w:firstLine="0"/>
+        <w:jc w:val="center"/>
+      </w:pPr>
+      <w:r>
+        <w:rPr>
+          <w:rFonts w:ascii="Arial" w:hAnsi="Arial"/>
+          <w:sz w:val="20"/>
+        </w:rPr>
+        <w:t>$$\mathbf{D}(\boldsymbol{\nu}_r)\boldsymbol{\nu}_r = \begin{bmatrix} -(X_u + X_{u|u|}|u_r|)u_r \\\\ -(Y_v + Y_{v|v|}|v_r|)v_r \\\\ -(Z_w + Z_{w|w|}|w_r|)w_r \\\\ -(K_p + K_{p|p|}|p|)p \\\\ -(M_q + M_{q|q|}|q|)q \\\\ -(N_r + N_{r|r|}|r|)r \end{bmatrix}$$</w:t>
       </w:r>
     </w:p>
     <w:p>
@@ -12642,7 +11942,7 @@
           <w:rFonts w:ascii="Arial" w:hAnsi="Arial"/>
           <w:sz w:val="20"/>
         </w:rPr>
-        <w:t>$$\mathbf{f}_g^b = \mathbf{R}_n^b(\boldsymbol{\eta}_2) \begin{bmatrix} 0 \\ 0 \\ W \end{bmatrix} = \begin{bmatrix} -W\sin\theta \\ W\cos\theta\sin\phi \\ W\cos\theta\cos\phi \end{bmatrix}, \qquad \mathbf{f}_b^b = \mathbf{R}_n^b(\boldsymbol{\eta}_2) \begin{bmatrix} 0 \\ 0 \\ -B \end{bmatrix} = \begin{bmatrix} B\sin\theta \\ -B\cos\theta\sin\phi \\ -B\cos\theta\cos\phi \end{bmatrix}$$</w:t>
+        <w:t>$$\mathbf{f}_g^b = \mathbf{R}_n^b(\boldsymbol{\eta}_2) \begin{bmatrix} 0 \\\\ 0 \\\\ W \end{bmatrix} = \begin{bmatrix} -W\sin\theta \\\\ W\cos\theta\sin\phi \\\\ W\cos\theta\cos\phi \end{bmatrix}, \qquad \mathbf{f}_b^b = \mathbf{R}_n^b(\boldsymbol{\eta}_2) \begin{bmatrix} 0 \\\\ 0 \\\\ -B \end{bmatrix} = \begin{bmatrix} B\sin\theta \\\\ -B\cos\theta\sin\phi \\\\ -B\cos\theta\cos\phi \end{bmatrix}$$</w:t>
       </w:r>
     </w:p>
     <w:p>
@@ -12670,7 +11970,7 @@
           <w:rFonts w:ascii="Arial" w:hAnsi="Arial"/>
           <w:sz w:val="20"/>
         </w:rPr>
-        <w:t>$$\mathbf{f}_{\text{restoring}}^b = \mathbf{f}_g^b + \mathbf{f}_b^b = \begin{bmatrix} -(W - B)\sin\theta \\ (W - B)\cos\theta\sin\phi \\ (W - B)\cos\theta\cos\phi \end{bmatrix}$$</w:t>
+        <w:t>$$\mathbf{f}_{\text{restoring}}^b = \mathbf{f}_g^b + \mathbf{f}_b^b = \begin{bmatrix} -(W - B)\sin\theta \\\\ (W - B)\cos\theta\sin\phi \\\\ (W - B)\cos\theta\cos\phi \end{bmatrix}$$</w:t>
       </w:r>
     </w:p>
     <w:p>
@@ -12745,6 +12045,20 @@
     </w:p>
     <w:p>
       <w:pPr>
+        <w:spacing w:before="120" w:after="120"/>
+        <w:ind w:firstLine="0"/>
+        <w:jc w:val="center"/>
+      </w:pPr>
+      <w:r>
+        <w:rPr>
+          <w:rFonts w:ascii="Arial" w:hAnsi="Arial"/>
+          <w:sz w:val="20"/>
+        </w:rPr>
+        <w:t>$$\mathbf{g}(\boldsymbol{\eta}) = \begin{bmatrix} (W - B)\sin\theta \\\\ -(W - B)\cos\theta\sin\phi \\\\ -(W - B)\cos\theta\cos\phi \\\\ -(y_g W - y_b B)\cos\theta\cos\phi + (z_g W - z_b B)\cos\theta\sin\phi \\\\ (z_g W - z_b B)\sin\theta + (x_g W - x_b B)\cos\theta\cos\phi \\\\ -(x_g W - x_b B)\cos\theta\sin\phi - (y_g W - y_b B)\sin\theta \end{bmatrix}$$</w:t>
+      </w:r>
+    </w:p>
+    <w:p>
+      <w:pPr>
         <w:spacing w:after="80" w:line="276" w:lineRule="auto"/>
         <w:ind w:firstLine="567"/>
         <w:jc w:val="both"/>
@@ -12754,118 +12068,6 @@
           <w:rFonts w:ascii="Arial" w:hAnsi="Arial"/>
           <w:sz w:val="20"/>
         </w:rPr>
-        <w:t>$$\mathbf{g}(\boldsymbol{\eta}) = \begin{bmatrix}</w:t>
-      </w:r>
-    </w:p>
-    <w:p>
-      <w:pPr>
-        <w:spacing w:after="80" w:line="276" w:lineRule="auto"/>
-        <w:ind w:firstLine="567"/>
-        <w:jc w:val="both"/>
-      </w:pPr>
-      <w:r>
-        <w:rPr>
-          <w:rFonts w:ascii="Arial" w:hAnsi="Arial"/>
-          <w:sz w:val="20"/>
-        </w:rPr>
-        <w:t>(W - B)\sin\theta \\</w:t>
-      </w:r>
-    </w:p>
-    <w:p>
-      <w:pPr>
-        <w:spacing w:after="80" w:line="276" w:lineRule="auto"/>
-        <w:ind w:firstLine="567"/>
-        <w:jc w:val="both"/>
-      </w:pPr>
-      <w:r>
-        <w:rPr>
-          <w:rFonts w:ascii="Arial" w:hAnsi="Arial"/>
-          <w:sz w:val="20"/>
-        </w:rPr>
-        <w:t>-(W - B)\cos\theta\sin\phi \\</w:t>
-      </w:r>
-    </w:p>
-    <w:p>
-      <w:pPr>
-        <w:spacing w:after="80" w:line="276" w:lineRule="auto"/>
-        <w:ind w:firstLine="567"/>
-        <w:jc w:val="both"/>
-      </w:pPr>
-      <w:r>
-        <w:rPr>
-          <w:rFonts w:ascii="Arial" w:hAnsi="Arial"/>
-          <w:sz w:val="20"/>
-        </w:rPr>
-        <w:t>-(W - B)\cos\theta\cos\phi \\</w:t>
-      </w:r>
-    </w:p>
-    <w:p>
-      <w:pPr>
-        <w:spacing w:after="80" w:line="276" w:lineRule="auto"/>
-        <w:ind w:firstLine="567"/>
-        <w:jc w:val="both"/>
-      </w:pPr>
-      <w:r>
-        <w:rPr>
-          <w:rFonts w:ascii="Arial" w:hAnsi="Arial"/>
-          <w:sz w:val="20"/>
-        </w:rPr>
-        <w:t>-(y_g W - y_b B)\cos\theta\cos\phi + (z_g W - z_b B)\cos\theta\sin\phi \\</w:t>
-      </w:r>
-    </w:p>
-    <w:p>
-      <w:pPr>
-        <w:spacing w:after="80" w:line="276" w:lineRule="auto"/>
-        <w:ind w:firstLine="567"/>
-        <w:jc w:val="both"/>
-      </w:pPr>
-      <w:r>
-        <w:rPr>
-          <w:rFonts w:ascii="Arial" w:hAnsi="Arial"/>
-          <w:sz w:val="20"/>
-        </w:rPr>
-        <w:t>(z_g W - z_b B)\sin\theta + (x_g W - x_b B)\cos\theta\cos\phi \\</w:t>
-      </w:r>
-    </w:p>
-    <w:p>
-      <w:pPr>
-        <w:spacing w:after="80" w:line="276" w:lineRule="auto"/>
-        <w:ind w:firstLine="567"/>
-        <w:jc w:val="both"/>
-      </w:pPr>
-      <w:r>
-        <w:rPr>
-          <w:rFonts w:ascii="Arial" w:hAnsi="Arial"/>
-          <w:sz w:val="20"/>
-        </w:rPr>
-        <w:t>-(x_g W - x_b B)\cos\theta\sin\phi - (y_g W - y_b B)\sin\theta</w:t>
-      </w:r>
-    </w:p>
-    <w:p>
-      <w:pPr>
-        <w:spacing w:after="80" w:line="276" w:lineRule="auto"/>
-        <w:ind w:firstLine="567"/>
-        <w:jc w:val="both"/>
-      </w:pPr>
-      <w:r>
-        <w:rPr>
-          <w:rFonts w:ascii="Arial" w:hAnsi="Arial"/>
-          <w:sz w:val="20"/>
-        </w:rPr>
-        <w:t>\end{bmatrix}$$</w:t>
-      </w:r>
-    </w:p>
-    <w:p>
-      <w:pPr>
-        <w:spacing w:after="80" w:line="276" w:lineRule="auto"/>
-        <w:ind w:firstLine="567"/>
-        <w:jc w:val="both"/>
-      </w:pPr>
-      <w:r>
-        <w:rPr>
-          <w:rFonts w:ascii="Arial" w:hAnsi="Arial"/>
-          <w:sz w:val="20"/>
-        </w:rPr>
         <w:t>Pada wahana yang dirancang netral secara apung (</w:t>
       </w:r>
       <w:r>
@@ -12942,114 +12144,16 @@
     </w:p>
     <w:p>
       <w:pPr>
-        <w:spacing w:after="80" w:line="276" w:lineRule="auto"/>
-        <w:ind w:firstLine="567"/>
-        <w:jc w:val="both"/>
-      </w:pPr>
-      <w:r>
-        <w:rPr>
-          <w:rFonts w:ascii="Arial" w:hAnsi="Arial"/>
-          <w:sz w:val="20"/>
-        </w:rPr>
-        <w:t>$$\mathbf{g}(\boldsymbol{\eta}) = \begin{bmatrix}</w:t>
-      </w:r>
-    </w:p>
-    <w:p>
-      <w:pPr>
-        <w:spacing w:after="80" w:line="276" w:lineRule="auto"/>
-        <w:ind w:firstLine="567"/>
-        <w:jc w:val="both"/>
-      </w:pPr>
-      <w:r>
-        <w:rPr>
-          <w:rFonts w:ascii="Arial" w:hAnsi="Arial"/>
-          <w:sz w:val="20"/>
-        </w:rPr>
-        <w:t>0 \\</w:t>
-      </w:r>
-    </w:p>
-    <w:p>
-      <w:pPr>
-        <w:spacing w:after="80" w:line="276" w:lineRule="auto"/>
-        <w:ind w:firstLine="567"/>
-        <w:jc w:val="both"/>
-      </w:pPr>
-      <w:r>
-        <w:rPr>
-          <w:rFonts w:ascii="Arial" w:hAnsi="Arial"/>
-          <w:sz w:val="20"/>
-        </w:rPr>
-        <w:t>0 \\</w:t>
-      </w:r>
-    </w:p>
-    <w:p>
-      <w:pPr>
-        <w:spacing w:after="80" w:line="276" w:lineRule="auto"/>
-        <w:ind w:firstLine="567"/>
-        <w:jc w:val="both"/>
-      </w:pPr>
-      <w:r>
-        <w:rPr>
-          <w:rFonts w:ascii="Arial" w:hAnsi="Arial"/>
-          <w:sz w:val="20"/>
-        </w:rPr>
-        <w:t>0 \\</w:t>
-      </w:r>
-    </w:p>
-    <w:p>
-      <w:pPr>
-        <w:spacing w:after="80" w:line="276" w:lineRule="auto"/>
-        <w:ind w:firstLine="567"/>
-        <w:jc w:val="both"/>
-      </w:pPr>
-      <w:r>
-        <w:rPr>
-          <w:rFonts w:ascii="Arial" w:hAnsi="Arial"/>
-          <w:sz w:val="20"/>
-        </w:rPr>
-        <w:t>z_g W \cos\theta\sin\phi \\</w:t>
-      </w:r>
-    </w:p>
-    <w:p>
-      <w:pPr>
-        <w:spacing w:after="80" w:line="276" w:lineRule="auto"/>
-        <w:ind w:firstLine="567"/>
-        <w:jc w:val="both"/>
-      </w:pPr>
-      <w:r>
-        <w:rPr>
-          <w:rFonts w:ascii="Arial" w:hAnsi="Arial"/>
-          <w:sz w:val="20"/>
-        </w:rPr>
-        <w:t>z_g W \sin\theta \\</w:t>
-      </w:r>
-    </w:p>
-    <w:p>
-      <w:pPr>
-        <w:spacing w:after="80" w:line="276" w:lineRule="auto"/>
-        <w:ind w:firstLine="567"/>
-        <w:jc w:val="both"/>
-      </w:pPr>
-      <w:r>
-        <w:rPr>
-          <w:rFonts w:ascii="Arial" w:hAnsi="Arial"/>
-          <w:sz w:val="20"/>
-        </w:rPr>
-        <w:t>0</w:t>
-      </w:r>
-    </w:p>
-    <w:p>
-      <w:pPr>
-        <w:spacing w:after="80" w:line="276" w:lineRule="auto"/>
-        <w:ind w:firstLine="567"/>
-        <w:jc w:val="both"/>
-      </w:pPr>
-      <w:r>
-        <w:rPr>
-          <w:rFonts w:ascii="Arial" w:hAnsi="Arial"/>
-          <w:sz w:val="20"/>
-        </w:rPr>
-        <w:t>\end{bmatrix}$$</w:t>
+        <w:spacing w:before="120" w:after="120"/>
+        <w:ind w:firstLine="0"/>
+        <w:jc w:val="center"/>
+      </w:pPr>
+      <w:r>
+        <w:rPr>
+          <w:rFonts w:ascii="Arial" w:hAnsi="Arial"/>
+          <w:sz w:val="20"/>
+        </w:rPr>
+        <w:t>$$\mathbf{g}(\boldsymbol{\eta}) = \begin{bmatrix} 0 \\\\ 0 \\\\ 0 \\\\ z_g W \cos\theta\sin\phi \\\\ z_g W \sin\theta \\\\ 0 \end{bmatrix}$$</w:t>
       </w:r>
     </w:p>
     <w:p>
@@ -16925,7 +16029,7 @@
           <w:rFonts w:ascii="Arial" w:hAnsi="Arial"/>
           <w:sz w:val="20"/>
         </w:rPr>
-        <w:t>$$\mathbf{r}_i \times \mathbf{d}_i = \begin{bmatrix} y_i d_{z,i} - z_i d_{y,i} \\ z_i d_{x,i} - x_i d_{z,i} \\ x_i d_{y,i} - y_i d_{x,i} \end{bmatrix}$$</w:t>
+        <w:t>$$\mathbf{r}_i \times \mathbf{d}_i = \begin{bmatrix} y_i d_{z,i} - z_i d_{y,i} \\\\ z_i d_{x,i} - x_i d_{z,i} \\\\ x_i d_{y,i} - y_i d_{x,i} \end{bmatrix}$$</w:t>
       </w:r>
     </w:p>
     <w:p>
@@ -17582,6 +16686,20 @@
     </w:p>
     <w:p>
       <w:pPr>
+        <w:spacing w:before="120" w:after="120"/>
+        <w:ind w:firstLine="0"/>
+        <w:jc w:val="center"/>
+      </w:pPr>
+      <w:r>
+        <w:rPr>
+          <w:rFonts w:ascii="Arial" w:hAnsi="Arial"/>
+          <w:sz w:val="20"/>
+        </w:rPr>
+        <w:t>$$\mathbf{T}_{6 \times 8} = \begin{bmatrix} c &amp; c &amp; -c &amp; -c &amp; 0 &amp; 0 &amp; 0 &amp; 0 \\\\ c &amp; -c &amp; c &amp; -c &amp; 0 &amp; 0 &amp; 0 &amp; 0 \\\\ 0 &amp; 0 &amp; 0 &amp; 0 &amp; -1 &amp; -1 &amp; -1 &amp; -1 \\\\ 0 &amp; 0 &amp; 0 &amp; 0 &amp; +y_v &amp; -y_v &amp; +y_v &amp; -y_v \\\\ 0 &amp; 0 &amp; 0 &amp; 0 &amp; +x_v &amp; +x_v &amp; -x_v &amp; -x_v \\\\ +l_h &amp; -l_h &amp; -l_h &amp; +l_h &amp; 0 &amp; 0 &amp; 0 &amp; 0 \end{bmatrix}$$</w:t>
+      </w:r>
+    </w:p>
+    <w:p>
+      <w:pPr>
         <w:spacing w:after="80" w:line="276" w:lineRule="auto"/>
         <w:ind w:firstLine="567"/>
         <w:jc w:val="both"/>
@@ -17591,118 +16709,6 @@
           <w:rFonts w:ascii="Arial" w:hAnsi="Arial"/>
           <w:sz w:val="20"/>
         </w:rPr>
-        <w:t>$$\mathbf{T}_{6 \times 8} = \begin{bmatrix}</w:t>
-      </w:r>
-    </w:p>
-    <w:p>
-      <w:pPr>
-        <w:spacing w:after="80" w:line="276" w:lineRule="auto"/>
-        <w:ind w:firstLine="567"/>
-        <w:jc w:val="both"/>
-      </w:pPr>
-      <w:r>
-        <w:rPr>
-          <w:rFonts w:ascii="Arial" w:hAnsi="Arial"/>
-          <w:sz w:val="20"/>
-        </w:rPr>
-        <w:t>c &amp; c &amp; -c &amp; -c &amp; 0 &amp; 0 &amp; 0 &amp; 0 \\</w:t>
-      </w:r>
-    </w:p>
-    <w:p>
-      <w:pPr>
-        <w:spacing w:after="80" w:line="276" w:lineRule="auto"/>
-        <w:ind w:firstLine="567"/>
-        <w:jc w:val="both"/>
-      </w:pPr>
-      <w:r>
-        <w:rPr>
-          <w:rFonts w:ascii="Arial" w:hAnsi="Arial"/>
-          <w:sz w:val="20"/>
-        </w:rPr>
-        <w:t>c &amp; -c &amp; c &amp; -c &amp; 0 &amp; 0 &amp; 0 &amp; 0 \\</w:t>
-      </w:r>
-    </w:p>
-    <w:p>
-      <w:pPr>
-        <w:spacing w:after="80" w:line="276" w:lineRule="auto"/>
-        <w:ind w:firstLine="567"/>
-        <w:jc w:val="both"/>
-      </w:pPr>
-      <w:r>
-        <w:rPr>
-          <w:rFonts w:ascii="Arial" w:hAnsi="Arial"/>
-          <w:sz w:val="20"/>
-        </w:rPr>
-        <w:t>0 &amp; 0 &amp; 0 &amp; 0 &amp; -1 &amp; -1 &amp; -1 &amp; -1 \\</w:t>
-      </w:r>
-    </w:p>
-    <w:p>
-      <w:pPr>
-        <w:spacing w:after="80" w:line="276" w:lineRule="auto"/>
-        <w:ind w:firstLine="567"/>
-        <w:jc w:val="both"/>
-      </w:pPr>
-      <w:r>
-        <w:rPr>
-          <w:rFonts w:ascii="Arial" w:hAnsi="Arial"/>
-          <w:sz w:val="20"/>
-        </w:rPr>
-        <w:t>0 &amp; 0 &amp; 0 &amp; 0 &amp; +y_v &amp; -y_v &amp; +y_v &amp; -y_v \\</w:t>
-      </w:r>
-    </w:p>
-    <w:p>
-      <w:pPr>
-        <w:spacing w:after="80" w:line="276" w:lineRule="auto"/>
-        <w:ind w:firstLine="567"/>
-        <w:jc w:val="both"/>
-      </w:pPr>
-      <w:r>
-        <w:rPr>
-          <w:rFonts w:ascii="Arial" w:hAnsi="Arial"/>
-          <w:sz w:val="20"/>
-        </w:rPr>
-        <w:t>0 &amp; 0 &amp; 0 &amp; 0 &amp; +x_v &amp; +x_v &amp; -x_v &amp; -x_v \\</w:t>
-      </w:r>
-    </w:p>
-    <w:p>
-      <w:pPr>
-        <w:spacing w:after="80" w:line="276" w:lineRule="auto"/>
-        <w:ind w:firstLine="567"/>
-        <w:jc w:val="both"/>
-      </w:pPr>
-      <w:r>
-        <w:rPr>
-          <w:rFonts w:ascii="Arial" w:hAnsi="Arial"/>
-          <w:sz w:val="20"/>
-        </w:rPr>
-        <w:t>+l_h &amp; -l_h &amp; -l_h &amp; +l_h &amp; 0 &amp; 0 &amp; 0 &amp; 0</w:t>
-      </w:r>
-    </w:p>
-    <w:p>
-      <w:pPr>
-        <w:spacing w:after="80" w:line="276" w:lineRule="auto"/>
-        <w:ind w:firstLine="567"/>
-        <w:jc w:val="both"/>
-      </w:pPr>
-      <w:r>
-        <w:rPr>
-          <w:rFonts w:ascii="Arial" w:hAnsi="Arial"/>
-          <w:sz w:val="20"/>
-        </w:rPr>
-        <w:t>\end{bmatrix}$$</w:t>
-      </w:r>
-    </w:p>
-    <w:p>
-      <w:pPr>
-        <w:spacing w:after="80" w:line="276" w:lineRule="auto"/>
-        <w:ind w:firstLine="567"/>
-        <w:jc w:val="both"/>
-      </w:pPr>
-      <w:r>
-        <w:rPr>
-          <w:rFonts w:ascii="Arial" w:hAnsi="Arial"/>
-          <w:sz w:val="20"/>
-        </w:rPr>
         <w:t>Substitusi nilai parameter numerik (</w:t>
       </w:r>
       <w:r>
@@ -17764,114 +16770,16 @@
     </w:p>
     <w:p>
       <w:pPr>
-        <w:spacing w:after="80" w:line="276" w:lineRule="auto"/>
-        <w:ind w:firstLine="567"/>
-        <w:jc w:val="both"/>
-      </w:pPr>
-      <w:r>
-        <w:rPr>
-          <w:rFonts w:ascii="Arial" w:hAnsi="Arial"/>
-          <w:sz w:val="20"/>
-        </w:rPr>
-        <w:t>$$\mathbf{T}_{6 \times 8} = \begin{bmatrix}</w:t>
-      </w:r>
-    </w:p>
-    <w:p>
-      <w:pPr>
-        <w:spacing w:after="80" w:line="276" w:lineRule="auto"/>
-        <w:ind w:firstLine="567"/>
-        <w:jc w:val="both"/>
-      </w:pPr>
-      <w:r>
-        <w:rPr>
-          <w:rFonts w:ascii="Arial" w:hAnsi="Arial"/>
-          <w:sz w:val="20"/>
-        </w:rPr>
-        <w:t>0.7071 &amp; 0.7071 &amp; -0.7071 &amp; -0.7071 &amp; 0 &amp; 0 &amp; 0 &amp; 0 \\</w:t>
-      </w:r>
-    </w:p>
-    <w:p>
-      <w:pPr>
-        <w:spacing w:after="80" w:line="276" w:lineRule="auto"/>
-        <w:ind w:firstLine="567"/>
-        <w:jc w:val="both"/>
-      </w:pPr>
-      <w:r>
-        <w:rPr>
-          <w:rFonts w:ascii="Arial" w:hAnsi="Arial"/>
-          <w:sz w:val="20"/>
-        </w:rPr>
-        <w:t>0.7071 &amp; -0.7071 &amp; 0.7071 &amp; -0.7071 &amp; 0 &amp; 0 &amp; 0 &amp; 0 \\</w:t>
-      </w:r>
-    </w:p>
-    <w:p>
-      <w:pPr>
-        <w:spacing w:after="80" w:line="276" w:lineRule="auto"/>
-        <w:ind w:firstLine="567"/>
-        <w:jc w:val="both"/>
-      </w:pPr>
-      <w:r>
-        <w:rPr>
-          <w:rFonts w:ascii="Arial" w:hAnsi="Arial"/>
-          <w:sz w:val="20"/>
-        </w:rPr>
-        <w:t>0 &amp; 0 &amp; 0 &amp; 0 &amp; -1.0 &amp; -1.0 &amp; -1.0 &amp; -1.0 \\</w:t>
-      </w:r>
-    </w:p>
-    <w:p>
-      <w:pPr>
-        <w:spacing w:after="80" w:line="276" w:lineRule="auto"/>
-        <w:ind w:firstLine="567"/>
-        <w:jc w:val="both"/>
-      </w:pPr>
-      <w:r>
-        <w:rPr>
-          <w:rFonts w:ascii="Arial" w:hAnsi="Arial"/>
-          <w:sz w:val="20"/>
-        </w:rPr>
-        <w:t>0 &amp; 0 &amp; 0 &amp; 0 &amp; 0.218 &amp; -0.218 &amp; 0.218 &amp; -0.218 \\</w:t>
-      </w:r>
-    </w:p>
-    <w:p>
-      <w:pPr>
-        <w:spacing w:after="80" w:line="276" w:lineRule="auto"/>
-        <w:ind w:firstLine="567"/>
-        <w:jc w:val="both"/>
-      </w:pPr>
-      <w:r>
-        <w:rPr>
-          <w:rFonts w:ascii="Arial" w:hAnsi="Arial"/>
-          <w:sz w:val="20"/>
-        </w:rPr>
-        <w:t>0 &amp; 0 &amp; 0 &amp; 0 &amp; 0.120 &amp; 0.120 &amp; -0.120 &amp; -0.120 \\</w:t>
-      </w:r>
-    </w:p>
-    <w:p>
-      <w:pPr>
-        <w:spacing w:after="80" w:line="276" w:lineRule="auto"/>
-        <w:ind w:firstLine="567"/>
-        <w:jc w:val="both"/>
-      </w:pPr>
-      <w:r>
-        <w:rPr>
-          <w:rFonts w:ascii="Arial" w:hAnsi="Arial"/>
-          <w:sz w:val="20"/>
-        </w:rPr>
-        <w:t>0.1888 &amp; -0.1888 &amp; -0.1888 &amp; 0.1888 &amp; 0 &amp; 0 &amp; 0 &amp; 0</w:t>
-      </w:r>
-    </w:p>
-    <w:p>
-      <w:pPr>
-        <w:spacing w:after="80" w:line="276" w:lineRule="auto"/>
-        <w:ind w:firstLine="567"/>
-        <w:jc w:val="both"/>
-      </w:pPr>
-      <w:r>
-        <w:rPr>
-          <w:rFonts w:ascii="Arial" w:hAnsi="Arial"/>
-          <w:sz w:val="20"/>
-        </w:rPr>
-        <w:t>\end{bmatrix}$$</w:t>
+        <w:spacing w:before="120" w:after="120"/>
+        <w:ind w:firstLine="0"/>
+        <w:jc w:val="center"/>
+      </w:pPr>
+      <w:r>
+        <w:rPr>
+          <w:rFonts w:ascii="Arial" w:hAnsi="Arial"/>
+          <w:sz w:val="20"/>
+        </w:rPr>
+        <w:t>$$\mathbf{T}_{6 \times 8} = \begin{bmatrix} 0.7071 &amp; 0.7071 &amp; -0.7071 &amp; -0.7071 &amp; 0 &amp; 0 &amp; 0 &amp; 0 \\\\ 0.7071 &amp; -0.7071 &amp; 0.7071 &amp; -0.7071 &amp; 0 &amp; 0 &amp; 0 &amp; 0 \\\\ 0 &amp; 0 &amp; 0 &amp; 0 &amp; -1.0 &amp; -1.0 &amp; -1.0 &amp; -1.0 \\\\ 0 &amp; 0 &amp; 0 &amp; 0 &amp; 0.218 &amp; -0.218 &amp; 0.218 &amp; -0.218 \\\\ 0 &amp; 0 &amp; 0 &amp; 0 &amp; 0.120 &amp; 0.120 &amp; -0.120 &amp; -0.120 \\\\ 0.1888 &amp; -0.1888 &amp; -0.1888 &amp; 0.1888 &amp; 0 &amp; 0 &amp; 0 &amp; 0 \end{bmatrix}$$</w:t>
       </w:r>
     </w:p>
     <w:p>
@@ -21769,7 +20677,7 @@
           <w:rFonts w:ascii="Arial" w:hAnsi="Arial"/>
           <w:sz w:val="20"/>
         </w:rPr>
-        <w:t>$$\mathbf{x}_k = \begin{bmatrix} x_k \\ y_k \\ s_k \\ r_k \\ \dot{x}_k \\ \dot{y}_k \\ \dot{s}_k \\ \dot{r}_k \end{bmatrix} \in \mathbb{R}^8$$</w:t>
+        <w:t>$$\mathbf{x}_k = \begin{bmatrix} x_k \\\\ y_k \\\\ s_k \\\\ r_k \\ \dot{x}_k \\ \dot{y}_k \\ \dot{s}_k \\ \dot{r}_k \end{bmatrix} \in \mathbb{R}^8$$</w:t>
       </w:r>
     </w:p>
     <w:p>
@@ -22242,142 +21150,16 @@
     </w:p>
     <w:p>
       <w:pPr>
-        <w:spacing w:after="80" w:line="276" w:lineRule="auto"/>
-        <w:ind w:firstLine="567"/>
-        <w:jc w:val="both"/>
-      </w:pPr>
-      <w:r>
-        <w:rPr>
-          <w:rFonts w:ascii="Arial" w:hAnsi="Arial"/>
-          <w:sz w:val="20"/>
-        </w:rPr>
-        <w:t>$$\mathbf{A}(\Delta t) = \begin{bmatrix} \mathbf{I}_{4 \times 4} &amp; \Delta t \mathbf{I}_{4 \times 4} \\ \mathbf{0}_{4 \times 4} &amp; \mathbf{I}_{4 \times 4} \end{bmatrix} = \begin{bmatrix}</w:t>
-      </w:r>
-    </w:p>
-    <w:p>
-      <w:pPr>
-        <w:spacing w:after="80" w:line="276" w:lineRule="auto"/>
-        <w:ind w:firstLine="567"/>
-        <w:jc w:val="both"/>
-      </w:pPr>
-      <w:r>
-        <w:rPr>
-          <w:rFonts w:ascii="Arial" w:hAnsi="Arial"/>
-          <w:sz w:val="20"/>
-        </w:rPr>
-        <w:t>1 &amp; 0 &amp; 0 &amp; 0 &amp; \Delta t &amp; 0 &amp; 0 &amp; 0 \\</w:t>
-      </w:r>
-    </w:p>
-    <w:p>
-      <w:pPr>
-        <w:spacing w:after="80" w:line="276" w:lineRule="auto"/>
-        <w:ind w:firstLine="567"/>
-        <w:jc w:val="both"/>
-      </w:pPr>
-      <w:r>
-        <w:rPr>
-          <w:rFonts w:ascii="Arial" w:hAnsi="Arial"/>
-          <w:sz w:val="20"/>
-        </w:rPr>
-        <w:t>0 &amp; 1 &amp; 0 &amp; 0 &amp; 0 &amp; \Delta t &amp; 0 &amp; 0 \\</w:t>
-      </w:r>
-    </w:p>
-    <w:p>
-      <w:pPr>
-        <w:spacing w:after="80" w:line="276" w:lineRule="auto"/>
-        <w:ind w:firstLine="567"/>
-        <w:jc w:val="both"/>
-      </w:pPr>
-      <w:r>
-        <w:rPr>
-          <w:rFonts w:ascii="Arial" w:hAnsi="Arial"/>
-          <w:sz w:val="20"/>
-        </w:rPr>
-        <w:t>0 &amp; 0 &amp; 1 &amp; 0 &amp; 0 &amp; 0 &amp; \Delta t &amp; 0 \\</w:t>
-      </w:r>
-    </w:p>
-    <w:p>
-      <w:pPr>
-        <w:spacing w:after="80" w:line="276" w:lineRule="auto"/>
-        <w:ind w:firstLine="567"/>
-        <w:jc w:val="both"/>
-      </w:pPr>
-      <w:r>
-        <w:rPr>
-          <w:rFonts w:ascii="Arial" w:hAnsi="Arial"/>
-          <w:sz w:val="20"/>
-        </w:rPr>
-        <w:t>0 &amp; 0 &amp; 0 &amp; 1 &amp; 0 &amp; 0 &amp; 0 &amp; \Delta t \\</w:t>
-      </w:r>
-    </w:p>
-    <w:p>
-      <w:pPr>
-        <w:spacing w:after="80" w:line="276" w:lineRule="auto"/>
-        <w:ind w:firstLine="567"/>
-        <w:jc w:val="both"/>
-      </w:pPr>
-      <w:r>
-        <w:rPr>
-          <w:rFonts w:ascii="Arial" w:hAnsi="Arial"/>
-          <w:sz w:val="20"/>
-        </w:rPr>
-        <w:t>0 &amp; 0 &amp; 0 &amp; 0 &amp; 1 &amp; 0 &amp; 0 &amp; 0 \\</w:t>
-      </w:r>
-    </w:p>
-    <w:p>
-      <w:pPr>
-        <w:spacing w:after="80" w:line="276" w:lineRule="auto"/>
-        <w:ind w:firstLine="567"/>
-        <w:jc w:val="both"/>
-      </w:pPr>
-      <w:r>
-        <w:rPr>
-          <w:rFonts w:ascii="Arial" w:hAnsi="Arial"/>
-          <w:sz w:val="20"/>
-        </w:rPr>
-        <w:t>0 &amp; 0 &amp; 0 &amp; 0 &amp; 0 &amp; 1 &amp; 0 &amp; 0 \\</w:t>
-      </w:r>
-    </w:p>
-    <w:p>
-      <w:pPr>
-        <w:spacing w:after="80" w:line="276" w:lineRule="auto"/>
-        <w:ind w:firstLine="567"/>
-        <w:jc w:val="both"/>
-      </w:pPr>
-      <w:r>
-        <w:rPr>
-          <w:rFonts w:ascii="Arial" w:hAnsi="Arial"/>
-          <w:sz w:val="20"/>
-        </w:rPr>
-        <w:t>0 &amp; 0 &amp; 0 &amp; 0 &amp; 0 &amp; 0 &amp; 1 &amp; 0 \\</w:t>
-      </w:r>
-    </w:p>
-    <w:p>
-      <w:pPr>
-        <w:spacing w:after="80" w:line="276" w:lineRule="auto"/>
-        <w:ind w:firstLine="567"/>
-        <w:jc w:val="both"/>
-      </w:pPr>
-      <w:r>
-        <w:rPr>
-          <w:rFonts w:ascii="Arial" w:hAnsi="Arial"/>
-          <w:sz w:val="20"/>
-        </w:rPr>
-        <w:t>0 &amp; 0 &amp; 0 &amp; 0 &amp; 0 &amp; 0 &amp; 0 &amp; 1</w:t>
-      </w:r>
-    </w:p>
-    <w:p>
-      <w:pPr>
-        <w:spacing w:after="80" w:line="276" w:lineRule="auto"/>
-        <w:ind w:firstLine="567"/>
-        <w:jc w:val="both"/>
-      </w:pPr>
-      <w:r>
-        <w:rPr>
-          <w:rFonts w:ascii="Arial" w:hAnsi="Arial"/>
-          <w:sz w:val="20"/>
-        </w:rPr>
-        <w:t>\end{bmatrix}$$</w:t>
+        <w:spacing w:before="120" w:after="120"/>
+        <w:ind w:firstLine="0"/>
+        <w:jc w:val="center"/>
+      </w:pPr>
+      <w:r>
+        <w:rPr>
+          <w:rFonts w:ascii="Arial" w:hAnsi="Arial"/>
+          <w:sz w:val="20"/>
+        </w:rPr>
+        <w:t>$$\mathbf{A}(\Delta t) = \begin{bmatrix} \mathbf{I}_{4 \times 4} &amp; \Delta t \mathbf{I}_{4 \times 4} \\ \mathbf{0}_{4 \times 4} &amp; \mathbf{I}_{4 \times 4} \end{bmatrix} = \begin{bmatrix} 1 &amp; 0 &amp; 0 &amp; 0 &amp; \Delta t &amp; 0 &amp; 0 &amp; 0 \\\\ 0 &amp; 1 &amp; 0 &amp; 0 &amp; 0 &amp; \Delta t &amp; 0 &amp; 0 \\\\ 0 &amp; 0 &amp; 1 &amp; 0 &amp; 0 &amp; 0 &amp; \Delta t &amp; 0 \\\\ 0 &amp; 0 &amp; 0 &amp; 1 &amp; 0 &amp; 0 &amp; 0 &amp; \Delta t \\\\ 0 &amp; 0 &amp; 0 &amp; 0 &amp; 1 &amp; 0 &amp; 0 &amp; 0 \\\\ 0 &amp; 0 &amp; 0 &amp; 0 &amp; 0 &amp; 1 &amp; 0 &amp; 0 \\\\ 0 &amp; 0 &amp; 0 &amp; 0 &amp; 0 &amp; 0 &amp; 1 &amp; 0 \\\\ 0 &amp; 0 &amp; 0 &amp; 0 &amp; 0 &amp; 0 &amp; 0 &amp; 1 \end{bmatrix}$$</w:t>
       </w:r>
     </w:p>
     <w:p>
@@ -22539,7 +21321,7 @@
           <w:rFonts w:ascii="Arial" w:hAnsi="Arial"/>
           <w:sz w:val="20"/>
         </w:rPr>
-        <w:t>$$\mathbf{z}_k = \begin{bmatrix} z_x \\ z_y \\ z_s \\ z_r \end{bmatrix}_k = \mathbf{H} \mathbf{x}_k + \mathbf{v}_k, \qquad \mathbf{H} = \begin{bmatrix} \mathbf{I}_{4 \times 4} &amp; \mathbf{0}_{4 \times 4} \end{bmatrix} \in \mathbb{R}^{4 \times 8}$$</w:t>
+        <w:t>$$\mathbf{z}_k = \begin{bmatrix} z_x \\\\ z_y \\\\ z_s \\\\ z_r \end{bmatrix}_k = \mathbf{H} \mathbf{x}_k + \mathbf{v}_k, \qquad \mathbf{H} = \begin{bmatrix} \mathbf{I}_{4 \times 4} &amp; \mathbf{0}_{4 \times 4} \end{bmatrix} \in \mathbb{R}^{4 \times 8}$$</w:t>
       </w:r>
     </w:p>
     <w:p>
@@ -23123,58 +21905,16 @@
     </w:p>
     <w:p>
       <w:pPr>
-        <w:spacing w:after="80" w:line="276" w:lineRule="auto"/>
-        <w:ind w:firstLine="567"/>
-        <w:jc w:val="both"/>
-      </w:pPr>
-      <w:r>
-        <w:rPr>
-          <w:rFonts w:ascii="Arial" w:hAnsi="Arial"/>
-          <w:sz w:val="20"/>
-        </w:rPr>
-        <w:t>$$\begin{cases}</w:t>
-      </w:r>
-    </w:p>
-    <w:p>
-      <w:pPr>
-        <w:spacing w:after="80" w:line="276" w:lineRule="auto"/>
-        <w:ind w:firstLine="567"/>
-        <w:jc w:val="both"/>
-      </w:pPr>
-      <w:r>
-        <w:rPr>
-          <w:rFonts w:ascii="Arial" w:hAnsi="Arial"/>
-          <w:sz w:val="20"/>
-        </w:rPr>
-        <w:t>\text{Diterima (Valid)}: &amp; D_M^2 \le \gamma_{\text{gate}} \implies \text{Lakukan pembaruan Kalman (Update Posterior)} \\</w:t>
-      </w:r>
-    </w:p>
-    <w:p>
-      <w:pPr>
-        <w:spacing w:after="80" w:line="276" w:lineRule="auto"/>
-        <w:ind w:firstLine="567"/>
-        <w:jc w:val="both"/>
-      </w:pPr>
-      <w:r>
-        <w:rPr>
-          <w:rFonts w:ascii="Arial" w:hAnsi="Arial"/>
-          <w:sz w:val="20"/>
-        </w:rPr>
-        <w:t>\text{Ditolak (Outlier)}: &amp; D_M^2 &gt; \gamma_{\text{gate}} \implies \text{Abaikan pengukuran, lakukan propagasi dead-reckoning}</w:t>
-      </w:r>
-    </w:p>
-    <w:p>
-      <w:pPr>
-        <w:spacing w:after="80" w:line="276" w:lineRule="auto"/>
-        <w:ind w:firstLine="567"/>
-        <w:jc w:val="both"/>
-      </w:pPr>
-      <w:r>
-        <w:rPr>
-          <w:rFonts w:ascii="Arial" w:hAnsi="Arial"/>
-          <w:sz w:val="20"/>
-        </w:rPr>
-        <w:t>\end{cases}$$</w:t>
+        <w:spacing w:before="120" w:after="120"/>
+        <w:ind w:firstLine="0"/>
+        <w:jc w:val="center"/>
+      </w:pPr>
+      <w:r>
+        <w:rPr>
+          <w:rFonts w:ascii="Arial" w:hAnsi="Arial"/>
+          <w:sz w:val="20"/>
+        </w:rPr>
+        <w:t>$$\begin{cases} \text{Diterima (Valid)}: &amp; D_M^2 \le \gamma_{\text{gate}} \implies \text{Lakukan pembaruan Kalman (Update Posterior)} \\\ \text{Ditolak (Outlier)}: &amp; D_M^2 &gt; \gamma_{\text{gate}} \implies \text{Abaikan pengukuran, lakukan propagasi dead-reckoning} \end{cases}$$</w:t>
       </w:r>
     </w:p>
     <w:p>
@@ -23725,114 +22465,16 @@
     </w:p>
     <w:p>
       <w:pPr>
-        <w:spacing w:after="80" w:line="276" w:lineRule="auto"/>
-        <w:ind w:firstLine="567"/>
-        <w:jc w:val="both"/>
-      </w:pPr>
-      <w:r>
-        <w:rPr>
-          <w:rFonts w:ascii="Arial" w:hAnsi="Arial"/>
-          <w:sz w:val="20"/>
-        </w:rPr>
-        <w:t>$$\mathbf{D}^(\boldsymbol{\nu}_r) = \text{diag}\begin{bmatrix}</w:t>
-      </w:r>
-    </w:p>
-    <w:p>
-      <w:pPr>
-        <w:spacing w:after="80" w:line="276" w:lineRule="auto"/>
-        <w:ind w:firstLine="567"/>
-        <w:jc w:val="both"/>
-      </w:pPr>
-      <w:r>
-        <w:rPr>
-          <w:rFonts w:ascii="Arial" w:hAnsi="Arial"/>
-          <w:sz w:val="20"/>
-        </w:rPr>
-        <w:t>-(X_u + 2 X_{u|u|} |u_r|) \\</w:t>
-      </w:r>
-    </w:p>
-    <w:p>
-      <w:pPr>
-        <w:spacing w:after="80" w:line="276" w:lineRule="auto"/>
-        <w:ind w:firstLine="567"/>
-        <w:jc w:val="both"/>
-      </w:pPr>
-      <w:r>
-        <w:rPr>
-          <w:rFonts w:ascii="Arial" w:hAnsi="Arial"/>
-          <w:sz w:val="20"/>
-        </w:rPr>
-        <w:t>-(Y_v + 2 Y_{v|v|} |v_r|) \\</w:t>
-      </w:r>
-    </w:p>
-    <w:p>
-      <w:pPr>
-        <w:spacing w:after="80" w:line="276" w:lineRule="auto"/>
-        <w:ind w:firstLine="567"/>
-        <w:jc w:val="both"/>
-      </w:pPr>
-      <w:r>
-        <w:rPr>
-          <w:rFonts w:ascii="Arial" w:hAnsi="Arial"/>
-          <w:sz w:val="20"/>
-        </w:rPr>
-        <w:t>-(Z_w + 2 Z_{w|w|} |w_r|) \\</w:t>
-      </w:r>
-    </w:p>
-    <w:p>
-      <w:pPr>
-        <w:spacing w:after="80" w:line="276" w:lineRule="auto"/>
-        <w:ind w:firstLine="567"/>
-        <w:jc w:val="both"/>
-      </w:pPr>
-      <w:r>
-        <w:rPr>
-          <w:rFonts w:ascii="Arial" w:hAnsi="Arial"/>
-          <w:sz w:val="20"/>
-        </w:rPr>
-        <w:t>-(K_p + 2 K_{p|p|} |p|) \\</w:t>
-      </w:r>
-    </w:p>
-    <w:p>
-      <w:pPr>
-        <w:spacing w:after="80" w:line="276" w:lineRule="auto"/>
-        <w:ind w:firstLine="567"/>
-        <w:jc w:val="both"/>
-      </w:pPr>
-      <w:r>
-        <w:rPr>
-          <w:rFonts w:ascii="Arial" w:hAnsi="Arial"/>
-          <w:sz w:val="20"/>
-        </w:rPr>
-        <w:t>-(M_q + 2 M_{q|q|} |q|) \\</w:t>
-      </w:r>
-    </w:p>
-    <w:p>
-      <w:pPr>
-        <w:spacing w:after="80" w:line="276" w:lineRule="auto"/>
-        <w:ind w:firstLine="567"/>
-        <w:jc w:val="both"/>
-      </w:pPr>
-      <w:r>
-        <w:rPr>
-          <w:rFonts w:ascii="Arial" w:hAnsi="Arial"/>
-          <w:sz w:val="20"/>
-        </w:rPr>
-        <w:t>-(N_r + 2 N_{r|r|} |r|)</w:t>
-      </w:r>
-    </w:p>
-    <w:p>
-      <w:pPr>
-        <w:spacing w:after="80" w:line="276" w:lineRule="auto"/>
-        <w:ind w:firstLine="567"/>
-        <w:jc w:val="both"/>
-      </w:pPr>
-      <w:r>
-        <w:rPr>
-          <w:rFonts w:ascii="Arial" w:hAnsi="Arial"/>
-          <w:sz w:val="20"/>
-        </w:rPr>
-        <w:t>\end{bmatrix}$$</w:t>
+        <w:spacing w:before="120" w:after="120"/>
+        <w:ind w:firstLine="0"/>
+        <w:jc w:val="center"/>
+      </w:pPr>
+      <w:r>
+        <w:rPr>
+          <w:rFonts w:ascii="Arial" w:hAnsi="Arial"/>
+          <w:sz w:val="20"/>
+        </w:rPr>
+        <w:t>$$\mathbf{D}^*(\boldsymbol{\nu}_r) = \text{diag}\begin{bmatrix} -(X_u + 2 X_{u|u|} |u_r|) \\\\ -(Y_v + 2 Y_{v|v|} |v_r|) \\\\ -(Z_w + 2 Z_{w|w|} |w_r|) \\\\ -(K_p + 2 K_{p|p|} |p|) \\\\ -(M_q + 2 M_{q|q|} |q|) \\\\ -(N_r + 2 N_{r|r|} |r|) \end{bmatrix}$$</w:t>
       </w:r>
     </w:p>
     <w:p>

</xml_diff>